<commit_message>
Stage 4 revision v2: restructured manuscript with numbered equations (OMML), timing/sensitivity analyses (R10, R11, bounds, per-market), IA tables, response to reviewers, re-review inputs
Co-Authored-By: Claude Opus 5.5 <noreply@anthropic.com>
Claude-Session: https://claude.ai/code/session_01Ka6Duc4zGYgPZcHc3gHgFv
</commit_message>
<xml_diff>
--- a/manuscript/Internet_Appendix.docx
+++ b/manuscript/Internet_Appendix.docx
@@ -23,7 +23,7 @@
         <w:rPr>
           <w:b/>
         </w:rPr>
-        <w:t>Rated Firms Gain Value Before, Not After, Their First ESG Score: Evidence from Five Southeast Asian Markets</w:t>
+        <w:t>Rated at the Peak? Firm Valuation around the First LSEG ESG Score in Five Southeast Asian Markets</w:t>
       </w:r>
     </w:p>
     <w:p>
@@ -33,7 +33,7 @@
       </w:pPr>
       <w:r>
         <w:rPr/>
-        <w:t>This Internet Appendix accompanies "Rated Firms Gain Value Before, Not After, Their First ESG Score: Evidence from Five Southeast Asian Markets." Table IA1 re-estimates the average effects of the first ESG score over event years 0 to 3 after excluding one market at a time. Table IA2 and Figure IA1 show the number of non-financial firms that received their first LSEG ESG score in each year, by market.</w:t>
+        <w:t>This Internet Appendix accompanies "Rated at the Peak? Firm Valuation around the First LSEG ESG Score in Five Southeast Asian Markets." Table IA1 re-estimates the average effects of the first score over event years 0 to 3 after excluding one market at a time. Table IA2 and Figure IA1 show the number of non-financial firms that received their first LSEG ESG score in each year, by market. Table IA3 reports the estimates for each market separately, Table IA4 the number of firm-years available for each outcome, and Table IA5 the relative-magnitude bounds of Eq. (10) in the paper. The pre-analysis plan is provided with the replication package.</w:t>
       </w:r>
     </w:p>
     <w:p>
@@ -56,7 +56,7 @@
       </w:r>
       <w:r>
         <w:rPr/>
-        <w:t>Leave-one-market-out estimates of the average effect of the first ESG score</w:t>
+        <w:t>Leave-one-market-out estimates of the average effect of the first LSEG ESG score</w:t>
       </w:r>
     </w:p>
     <w:tbl>
@@ -2288,6 +2288,3073 @@
         <w:br w:type="page"/>
       </w:r>
     </w:p>
+    <w:p>
+      <w:pPr>
+        <w:spacing w:line="240" w:lineRule="auto" w:after="120" w:before="0"/>
+      </w:pPr>
+      <w:r>
+        <w:rPr>
+          <w:b/>
+        </w:rPr>
+        <w:t>Table IA3</w:t>
+      </w:r>
+      <w:r>
+        <w:t xml:space="preserve"> </w:t>
+      </w:r>
+      <w:r>
+        <w:rPr/>
+        <w:t>Estimates of the average effect of the first LSEG ESG score by market</w:t>
+      </w:r>
+    </w:p>
+    <w:tbl>
+      <w:tblPr>
+        <w:tblW w:type="auto" w:w="0"/>
+        <w:jc w:val="center"/>
+        <w:tblLayout w:type="fixed"/>
+        <w:tblLook w:firstColumn="1" w:firstRow="1" w:lastColumn="0" w:lastRow="0" w:noHBand="0" w:noVBand="1" w:val="04A0"/>
+        <w:tblLayout w:type="fixed"/>
+      </w:tblPr>
+      <w:tblGrid>
+        <w:gridCol w:w="1872"/>
+        <w:gridCol w:w="1440"/>
+        <w:gridCol w:w="1440"/>
+        <w:gridCol w:w="1440"/>
+        <w:gridCol w:w="1440"/>
+        <w:gridCol w:w="1296"/>
+      </w:tblGrid>
+      <w:tr>
+        <w:tc>
+          <w:tcPr>
+            <w:tcW w:type="dxa" w:w="1872"/>
+            <w:tcBorders>
+              <w:top w:val="single" w:sz="6" w:color="000000"/>
+              <w:bottom w:val="single" w:sz="6" w:color="000000"/>
+            </w:tcBorders>
+          </w:tcPr>
+          <w:p>
+            <w:pPr>
+              <w:spacing w:after="0" w:line="240" w:lineRule="auto"/>
+            </w:pPr>
+            <w:r/>
+            <w:r>
+              <w:rPr>
+                <w:b/>
+                <w:sz w:val="18"/>
+              </w:rPr>
+              <w:t>Specification</w:t>
+            </w:r>
+          </w:p>
+        </w:tc>
+        <w:tc>
+          <w:tcPr>
+            <w:tcW w:type="dxa" w:w="1440"/>
+            <w:tcBorders>
+              <w:top w:val="single" w:sz="6" w:color="000000"/>
+              <w:bottom w:val="single" w:sz="6" w:color="000000"/>
+            </w:tcBorders>
+          </w:tcPr>
+          <w:p>
+            <w:pPr>
+              <w:spacing w:after="0" w:line="240" w:lineRule="auto"/>
+              <w:jc w:val="center"/>
+            </w:pPr>
+            <w:r/>
+            <w:r>
+              <w:rPr>
+                <w:b/>
+                <w:sz w:val="18"/>
+              </w:rPr>
+              <w:t>ln(MTB)</w:t>
+            </w:r>
+          </w:p>
+        </w:tc>
+        <w:tc>
+          <w:tcPr>
+            <w:tcW w:type="dxa" w:w="1440"/>
+            <w:tcBorders>
+              <w:top w:val="single" w:sz="6" w:color="000000"/>
+              <w:bottom w:val="single" w:sz="6" w:color="000000"/>
+            </w:tcBorders>
+          </w:tcPr>
+          <w:p>
+            <w:pPr>
+              <w:spacing w:after="0" w:line="240" w:lineRule="auto"/>
+              <w:jc w:val="center"/>
+            </w:pPr>
+            <w:r/>
+            <w:r>
+              <w:rPr>
+                <w:b/>
+                <w:sz w:val="18"/>
+              </w:rPr>
+              <w:t>ln(market capitalization)</w:t>
+            </w:r>
+          </w:p>
+        </w:tc>
+        <w:tc>
+          <w:tcPr>
+            <w:tcW w:type="dxa" w:w="1440"/>
+            <w:tcBorders>
+              <w:top w:val="single" w:sz="6" w:color="000000"/>
+              <w:bottom w:val="single" w:sz="6" w:color="000000"/>
+            </w:tcBorders>
+          </w:tcPr>
+          <w:p>
+            <w:pPr>
+              <w:spacing w:after="0" w:line="240" w:lineRule="auto"/>
+              <w:jc w:val="center"/>
+            </w:pPr>
+            <w:r/>
+            <w:r>
+              <w:rPr>
+                <w:b/>
+                <w:sz w:val="18"/>
+              </w:rPr>
+              <w:t>Book leverage</w:t>
+            </w:r>
+          </w:p>
+        </w:tc>
+        <w:tc>
+          <w:tcPr>
+            <w:tcW w:type="dxa" w:w="1440"/>
+            <w:tcBorders>
+              <w:top w:val="single" w:sz="6" w:color="000000"/>
+              <w:bottom w:val="single" w:sz="6" w:color="000000"/>
+            </w:tcBorders>
+          </w:tcPr>
+          <w:p>
+            <w:pPr>
+              <w:spacing w:after="0" w:line="240" w:lineRule="auto"/>
+              <w:jc w:val="center"/>
+            </w:pPr>
+            <w:r/>
+            <w:r>
+              <w:rPr>
+                <w:b/>
+                <w:sz w:val="18"/>
+              </w:rPr>
+              <w:t>ln(total assets)</w:t>
+            </w:r>
+          </w:p>
+        </w:tc>
+        <w:tc>
+          <w:tcPr>
+            <w:tcW w:type="dxa" w:w="1296"/>
+            <w:tcBorders>
+              <w:top w:val="single" w:sz="6" w:color="000000"/>
+              <w:bottom w:val="single" w:sz="6" w:color="000000"/>
+            </w:tcBorders>
+          </w:tcPr>
+          <w:p>
+            <w:pPr>
+              <w:spacing w:after="0" w:line="240" w:lineRule="auto"/>
+              <w:jc w:val="center"/>
+            </w:pPr>
+            <w:r/>
+            <w:r>
+              <w:rPr>
+                <w:b/>
+                <w:sz w:val="18"/>
+              </w:rPr>
+              <w:t>Scored firms (ln MTB)</w:t>
+            </w:r>
+          </w:p>
+        </w:tc>
+      </w:tr>
+      <w:tr>
+        <w:tc>
+          <w:tcPr>
+            <w:tcW w:type="dxa" w:w="1872"/>
+          </w:tcPr>
+          <w:p>
+            <w:pPr>
+              <w:spacing w:after="0" w:line="240" w:lineRule="auto"/>
+            </w:pPr>
+            <w:r/>
+            <w:r>
+              <w:rPr>
+                <w:sz w:val="18"/>
+              </w:rPr>
+              <w:t>Indonesia</w:t>
+            </w:r>
+          </w:p>
+        </w:tc>
+        <w:tc>
+          <w:tcPr>
+            <w:tcW w:type="dxa" w:w="1440"/>
+          </w:tcPr>
+          <w:p>
+            <w:pPr>
+              <w:spacing w:after="0" w:line="240" w:lineRule="auto"/>
+              <w:jc w:val="center"/>
+            </w:pPr>
+            <w:r/>
+            <w:r>
+              <w:rPr>
+                <w:sz w:val="18"/>
+              </w:rPr>
+              <w:t>0.054 (0.128)</w:t>
+            </w:r>
+          </w:p>
+        </w:tc>
+        <w:tc>
+          <w:tcPr>
+            <w:tcW w:type="dxa" w:w="1440"/>
+          </w:tcPr>
+          <w:p>
+            <w:pPr>
+              <w:spacing w:after="0" w:line="240" w:lineRule="auto"/>
+              <w:jc w:val="center"/>
+            </w:pPr>
+            <w:r/>
+            <w:r>
+              <w:rPr>
+                <w:sz w:val="18"/>
+              </w:rPr>
+              <w:t>−0.018 (0.109)</w:t>
+            </w:r>
+          </w:p>
+        </w:tc>
+        <w:tc>
+          <w:tcPr>
+            <w:tcW w:type="dxa" w:w="1440"/>
+          </w:tcPr>
+          <w:p>
+            <w:pPr>
+              <w:spacing w:after="0" w:line="240" w:lineRule="auto"/>
+              <w:jc w:val="center"/>
+            </w:pPr>
+            <w:r/>
+            <w:r>
+              <w:rPr>
+                <w:sz w:val="18"/>
+              </w:rPr>
+              <w:t>0.023 (0.018)</w:t>
+            </w:r>
+          </w:p>
+        </w:tc>
+        <w:tc>
+          <w:tcPr>
+            <w:tcW w:type="dxa" w:w="1440"/>
+          </w:tcPr>
+          <w:p>
+            <w:pPr>
+              <w:spacing w:after="0" w:line="240" w:lineRule="auto"/>
+              <w:jc w:val="center"/>
+            </w:pPr>
+            <w:r/>
+            <w:r>
+              <w:rPr>
+                <w:sz w:val="18"/>
+              </w:rPr>
+              <w:t>0.123* (0.070)</w:t>
+            </w:r>
+          </w:p>
+        </w:tc>
+        <w:tc>
+          <w:tcPr>
+            <w:tcW w:type="dxa" w:w="1296"/>
+          </w:tcPr>
+          <w:p>
+            <w:pPr>
+              <w:spacing w:after="0" w:line="240" w:lineRule="auto"/>
+              <w:jc w:val="center"/>
+            </w:pPr>
+            <w:r/>
+            <w:r>
+              <w:rPr>
+                <w:sz w:val="18"/>
+              </w:rPr>
+              <w:t>39</w:t>
+            </w:r>
+          </w:p>
+        </w:tc>
+      </w:tr>
+      <w:tr>
+        <w:tc>
+          <w:tcPr>
+            <w:tcW w:type="dxa" w:w="1872"/>
+          </w:tcPr>
+          <w:p>
+            <w:pPr>
+              <w:spacing w:after="0" w:line="240" w:lineRule="auto"/>
+            </w:pPr>
+            <w:r/>
+            <w:r>
+              <w:rPr>
+                <w:sz w:val="18"/>
+              </w:rPr>
+              <w:t>Malaysia</w:t>
+            </w:r>
+          </w:p>
+        </w:tc>
+        <w:tc>
+          <w:tcPr>
+            <w:tcW w:type="dxa" w:w="1440"/>
+          </w:tcPr>
+          <w:p>
+            <w:pPr>
+              <w:spacing w:after="0" w:line="240" w:lineRule="auto"/>
+              <w:jc w:val="center"/>
+            </w:pPr>
+            <w:r/>
+            <w:r>
+              <w:rPr>
+                <w:sz w:val="18"/>
+              </w:rPr>
+              <w:t>0.009 (0.033)</w:t>
+            </w:r>
+          </w:p>
+        </w:tc>
+        <w:tc>
+          <w:tcPr>
+            <w:tcW w:type="dxa" w:w="1440"/>
+          </w:tcPr>
+          <w:p>
+            <w:pPr>
+              <w:spacing w:after="0" w:line="240" w:lineRule="auto"/>
+              <w:jc w:val="center"/>
+            </w:pPr>
+            <w:r/>
+            <w:r>
+              <w:rPr>
+                <w:sz w:val="18"/>
+              </w:rPr>
+              <w:t>−0.114** (0.048)</w:t>
+            </w:r>
+          </w:p>
+        </w:tc>
+        <w:tc>
+          <w:tcPr>
+            <w:tcW w:type="dxa" w:w="1440"/>
+          </w:tcPr>
+          <w:p>
+            <w:pPr>
+              <w:spacing w:after="0" w:line="240" w:lineRule="auto"/>
+              <w:jc w:val="center"/>
+            </w:pPr>
+            <w:r/>
+            <w:r>
+              <w:rPr>
+                <w:sz w:val="18"/>
+              </w:rPr>
+              <w:t>0.002 (0.006)</w:t>
+            </w:r>
+          </w:p>
+        </w:tc>
+        <w:tc>
+          <w:tcPr>
+            <w:tcW w:type="dxa" w:w="1440"/>
+          </w:tcPr>
+          <w:p>
+            <w:pPr>
+              <w:spacing w:after="0" w:line="240" w:lineRule="auto"/>
+              <w:jc w:val="center"/>
+            </w:pPr>
+            <w:r/>
+            <w:r>
+              <w:rPr>
+                <w:sz w:val="18"/>
+              </w:rPr>
+              <w:t>0.033 (0.024)</w:t>
+            </w:r>
+          </w:p>
+        </w:tc>
+        <w:tc>
+          <w:tcPr>
+            <w:tcW w:type="dxa" w:w="1296"/>
+          </w:tcPr>
+          <w:p>
+            <w:pPr>
+              <w:spacing w:after="0" w:line="240" w:lineRule="auto"/>
+              <w:jc w:val="center"/>
+            </w:pPr>
+            <w:r/>
+            <w:r>
+              <w:rPr>
+                <w:sz w:val="18"/>
+              </w:rPr>
+              <w:t>372</w:t>
+            </w:r>
+          </w:p>
+        </w:tc>
+      </w:tr>
+      <w:tr>
+        <w:tc>
+          <w:tcPr>
+            <w:tcW w:type="dxa" w:w="1872"/>
+          </w:tcPr>
+          <w:p>
+            <w:pPr>
+              <w:spacing w:after="0" w:line="240" w:lineRule="auto"/>
+            </w:pPr>
+            <w:r/>
+            <w:r>
+              <w:rPr>
+                <w:sz w:val="18"/>
+              </w:rPr>
+              <w:t>Philippines</w:t>
+            </w:r>
+          </w:p>
+        </w:tc>
+        <w:tc>
+          <w:tcPr>
+            <w:tcW w:type="dxa" w:w="1440"/>
+          </w:tcPr>
+          <w:p>
+            <w:pPr>
+              <w:spacing w:after="0" w:line="240" w:lineRule="auto"/>
+              <w:jc w:val="center"/>
+            </w:pPr>
+            <w:r/>
+            <w:r>
+              <w:rPr>
+                <w:sz w:val="18"/>
+              </w:rPr>
+              <w:t>−0.006 (0.109)</w:t>
+            </w:r>
+          </w:p>
+        </w:tc>
+        <w:tc>
+          <w:tcPr>
+            <w:tcW w:type="dxa" w:w="1440"/>
+          </w:tcPr>
+          <w:p>
+            <w:pPr>
+              <w:spacing w:after="0" w:line="240" w:lineRule="auto"/>
+              <w:jc w:val="center"/>
+            </w:pPr>
+            <w:r/>
+            <w:r>
+              <w:rPr>
+                <w:sz w:val="18"/>
+              </w:rPr>
+              <w:t>0.101 (0.128)</w:t>
+            </w:r>
+          </w:p>
+        </w:tc>
+        <w:tc>
+          <w:tcPr>
+            <w:tcW w:type="dxa" w:w="1440"/>
+          </w:tcPr>
+          <w:p>
+            <w:pPr>
+              <w:spacing w:after="0" w:line="240" w:lineRule="auto"/>
+              <w:jc w:val="center"/>
+            </w:pPr>
+            <w:r/>
+            <w:r>
+              <w:rPr>
+                <w:sz w:val="18"/>
+              </w:rPr>
+              <w:t>0.041 (0.028)</w:t>
+            </w:r>
+          </w:p>
+        </w:tc>
+        <w:tc>
+          <w:tcPr>
+            <w:tcW w:type="dxa" w:w="1440"/>
+          </w:tcPr>
+          <w:p>
+            <w:pPr>
+              <w:spacing w:after="0" w:line="240" w:lineRule="auto"/>
+              <w:jc w:val="center"/>
+            </w:pPr>
+            <w:r/>
+            <w:r>
+              <w:rPr>
+                <w:sz w:val="18"/>
+              </w:rPr>
+              <w:t>0.025 (0.079)</w:t>
+            </w:r>
+          </w:p>
+        </w:tc>
+        <w:tc>
+          <w:tcPr>
+            <w:tcW w:type="dxa" w:w="1296"/>
+          </w:tcPr>
+          <w:p>
+            <w:pPr>
+              <w:spacing w:after="0" w:line="240" w:lineRule="auto"/>
+              <w:jc w:val="center"/>
+            </w:pPr>
+            <w:r/>
+            <w:r>
+              <w:rPr>
+                <w:sz w:val="18"/>
+              </w:rPr>
+              <w:t>14</w:t>
+            </w:r>
+          </w:p>
+        </w:tc>
+      </w:tr>
+      <w:tr>
+        <w:tc>
+          <w:tcPr>
+            <w:tcW w:type="dxa" w:w="1872"/>
+          </w:tcPr>
+          <w:p>
+            <w:pPr>
+              <w:spacing w:after="0" w:line="240" w:lineRule="auto"/>
+            </w:pPr>
+            <w:r/>
+            <w:r>
+              <w:rPr>
+                <w:sz w:val="18"/>
+              </w:rPr>
+              <w:t>Singapore</w:t>
+            </w:r>
+          </w:p>
+        </w:tc>
+        <w:tc>
+          <w:tcPr>
+            <w:tcW w:type="dxa" w:w="1440"/>
+          </w:tcPr>
+          <w:p>
+            <w:pPr>
+              <w:spacing w:after="0" w:line="240" w:lineRule="auto"/>
+              <w:jc w:val="center"/>
+            </w:pPr>
+            <w:r/>
+            <w:r>
+              <w:rPr>
+                <w:sz w:val="18"/>
+              </w:rPr>
+              <w:t>−0.037 (0.073)</w:t>
+            </w:r>
+          </w:p>
+        </w:tc>
+        <w:tc>
+          <w:tcPr>
+            <w:tcW w:type="dxa" w:w="1440"/>
+          </w:tcPr>
+          <w:p>
+            <w:pPr>
+              <w:spacing w:after="0" w:line="240" w:lineRule="auto"/>
+              <w:jc w:val="center"/>
+            </w:pPr>
+            <w:r/>
+            <w:r>
+              <w:rPr>
+                <w:sz w:val="18"/>
+              </w:rPr>
+              <w:t>0.143* (0.087)</w:t>
+            </w:r>
+          </w:p>
+        </w:tc>
+        <w:tc>
+          <w:tcPr>
+            <w:tcW w:type="dxa" w:w="1440"/>
+          </w:tcPr>
+          <w:p>
+            <w:pPr>
+              <w:spacing w:after="0" w:line="240" w:lineRule="auto"/>
+              <w:jc w:val="center"/>
+            </w:pPr>
+            <w:r/>
+            <w:r>
+              <w:rPr>
+                <w:sz w:val="18"/>
+              </w:rPr>
+              <w:t>0.048** (0.020)</w:t>
+            </w:r>
+          </w:p>
+        </w:tc>
+        <w:tc>
+          <w:tcPr>
+            <w:tcW w:type="dxa" w:w="1440"/>
+          </w:tcPr>
+          <w:p>
+            <w:pPr>
+              <w:spacing w:after="0" w:line="240" w:lineRule="auto"/>
+              <w:jc w:val="center"/>
+            </w:pPr>
+            <w:r/>
+            <w:r>
+              <w:rPr>
+                <w:sz w:val="18"/>
+              </w:rPr>
+              <w:t>0.013 (0.084)</w:t>
+            </w:r>
+          </w:p>
+        </w:tc>
+        <w:tc>
+          <w:tcPr>
+            <w:tcW w:type="dxa" w:w="1296"/>
+          </w:tcPr>
+          <w:p>
+            <w:pPr>
+              <w:spacing w:after="0" w:line="240" w:lineRule="auto"/>
+              <w:jc w:val="center"/>
+            </w:pPr>
+            <w:r/>
+            <w:r>
+              <w:rPr>
+                <w:sz w:val="18"/>
+              </w:rPr>
+              <w:t>46</w:t>
+            </w:r>
+          </w:p>
+        </w:tc>
+      </w:tr>
+      <w:tr>
+        <w:tc>
+          <w:tcPr>
+            <w:tcW w:type="dxa" w:w="1872"/>
+            <w:tcBorders>
+              <w:bottom w:val="single" w:sz="6" w:color="000000"/>
+            </w:tcBorders>
+          </w:tcPr>
+          <w:p>
+            <w:pPr>
+              <w:spacing w:after="0" w:line="240" w:lineRule="auto"/>
+            </w:pPr>
+            <w:r/>
+            <w:r>
+              <w:rPr>
+                <w:sz w:val="18"/>
+              </w:rPr>
+              <w:t>Thailand</w:t>
+            </w:r>
+          </w:p>
+        </w:tc>
+        <w:tc>
+          <w:tcPr>
+            <w:tcW w:type="dxa" w:w="1440"/>
+            <w:tcBorders>
+              <w:bottom w:val="single" w:sz="6" w:color="000000"/>
+            </w:tcBorders>
+          </w:tcPr>
+          <w:p>
+            <w:pPr>
+              <w:spacing w:after="0" w:line="240" w:lineRule="auto"/>
+              <w:jc w:val="center"/>
+            </w:pPr>
+            <w:r/>
+            <w:r>
+              <w:rPr>
+                <w:sz w:val="18"/>
+              </w:rPr>
+              <w:t>0.027 (0.047)</w:t>
+            </w:r>
+          </w:p>
+        </w:tc>
+        <w:tc>
+          <w:tcPr>
+            <w:tcW w:type="dxa" w:w="1440"/>
+            <w:tcBorders>
+              <w:bottom w:val="single" w:sz="6" w:color="000000"/>
+            </w:tcBorders>
+          </w:tcPr>
+          <w:p>
+            <w:pPr>
+              <w:spacing w:after="0" w:line="240" w:lineRule="auto"/>
+              <w:jc w:val="center"/>
+            </w:pPr>
+            <w:r/>
+            <w:r>
+              <w:rPr>
+                <w:sz w:val="18"/>
+              </w:rPr>
+              <w:t>0.059 (0.059)</w:t>
+            </w:r>
+          </w:p>
+        </w:tc>
+        <w:tc>
+          <w:tcPr>
+            <w:tcW w:type="dxa" w:w="1440"/>
+            <w:tcBorders>
+              <w:bottom w:val="single" w:sz="6" w:color="000000"/>
+            </w:tcBorders>
+          </w:tcPr>
+          <w:p>
+            <w:pPr>
+              <w:spacing w:after="0" w:line="240" w:lineRule="auto"/>
+              <w:jc w:val="center"/>
+            </w:pPr>
+            <w:r/>
+            <w:r>
+              <w:rPr>
+                <w:sz w:val="18"/>
+              </w:rPr>
+              <w:t>0.025* (0.013)</w:t>
+            </w:r>
+          </w:p>
+        </w:tc>
+        <w:tc>
+          <w:tcPr>
+            <w:tcW w:type="dxa" w:w="1440"/>
+            <w:tcBorders>
+              <w:bottom w:val="single" w:sz="6" w:color="000000"/>
+            </w:tcBorders>
+          </w:tcPr>
+          <w:p>
+            <w:pPr>
+              <w:spacing w:after="0" w:line="240" w:lineRule="auto"/>
+              <w:jc w:val="center"/>
+            </w:pPr>
+            <w:r/>
+            <w:r>
+              <w:rPr>
+                <w:sz w:val="18"/>
+              </w:rPr>
+              <w:t>0.017 (0.040)</w:t>
+            </w:r>
+          </w:p>
+        </w:tc>
+        <w:tc>
+          <w:tcPr>
+            <w:tcW w:type="dxa" w:w="1296"/>
+            <w:tcBorders>
+              <w:bottom w:val="single" w:sz="6" w:color="000000"/>
+            </w:tcBorders>
+          </w:tcPr>
+          <w:p>
+            <w:pPr>
+              <w:spacing w:after="0" w:line="240" w:lineRule="auto"/>
+              <w:jc w:val="center"/>
+            </w:pPr>
+            <w:r/>
+            <w:r>
+              <w:rPr>
+                <w:sz w:val="18"/>
+              </w:rPr>
+              <w:t>157</w:t>
+            </w:r>
+          </w:p>
+        </w:tc>
+      </w:tr>
+    </w:tbl>
+    <w:p>
+      <w:pPr>
+        <w:spacing w:line="240" w:lineRule="auto" w:after="40" w:before="0"/>
+      </w:pPr>
+      <w:r>
+        <w:rPr>
+          <w:sz w:val="20"/>
+        </w:rPr>
+        <w:t>Each cell reports the average effect over event years 0 to 3 with the bootstrap standard error in parentheses, estimated with scored and never-scored firms from the named market only; *, **, and *** denote significance at the 10%, 5%, and 1% levels based on unadjusted p-values.</w:t>
+      </w:r>
+    </w:p>
+    <w:p>
+      <w:pPr>
+        <w:spacing w:line="240" w:lineRule="auto" w:after="40" w:before="0"/>
+      </w:pPr>
+      <w:r>
+        <w:rPr>
+          <w:sz w:val="20"/>
+        </w:rPr>
+        <w:t>Source: Authors' calculations from LSEG ESG scores and Compustat Global.</w:t>
+      </w:r>
+    </w:p>
+    <w:p>
+      <w:r>
+        <w:br w:type="page"/>
+      </w:r>
+    </w:p>
+    <w:p>
+      <w:pPr>
+        <w:spacing w:line="240" w:lineRule="auto" w:after="120" w:before="0"/>
+      </w:pPr>
+      <w:r>
+        <w:rPr>
+          <w:b/>
+        </w:rPr>
+        <w:t>Table IA4</w:t>
+      </w:r>
+      <w:r>
+        <w:t xml:space="preserve"> </w:t>
+      </w:r>
+      <w:r>
+        <w:rPr/>
+        <w:t>Firm-years and firms available for each outcome</w:t>
+      </w:r>
+    </w:p>
+    <w:tbl>
+      <w:tblPr>
+        <w:tblW w:type="auto" w:w="0"/>
+        <w:jc w:val="center"/>
+        <w:tblLayout w:type="fixed"/>
+        <w:tblLook w:firstColumn="1" w:firstRow="1" w:lastColumn="0" w:lastRow="0" w:noHBand="0" w:noVBand="1" w:val="04A0"/>
+        <w:tblLayout w:type="fixed"/>
+      </w:tblPr>
+      <w:tblGrid>
+        <w:gridCol w:w="2448"/>
+        <w:gridCol w:w="1440"/>
+        <w:gridCol w:w="1296"/>
+        <w:gridCol w:w="1440"/>
+        <w:gridCol w:w="1296"/>
+        <w:gridCol w:w="1440"/>
+      </w:tblGrid>
+      <w:tr>
+        <w:tc>
+          <w:tcPr>
+            <w:tcW w:type="dxa" w:w="2448"/>
+            <w:tcBorders>
+              <w:top w:val="single" w:sz="6" w:color="000000"/>
+              <w:bottom w:val="single" w:sz="6" w:color="000000"/>
+            </w:tcBorders>
+          </w:tcPr>
+          <w:p>
+            <w:pPr>
+              <w:spacing w:after="0" w:line="240" w:lineRule="auto"/>
+            </w:pPr>
+            <w:r/>
+            <w:r>
+              <w:rPr>
+                <w:b/>
+                <w:sz w:val="18"/>
+              </w:rPr>
+              <w:t>Outcome</w:t>
+            </w:r>
+          </w:p>
+        </w:tc>
+        <w:tc>
+          <w:tcPr>
+            <w:tcW w:type="dxa" w:w="1440"/>
+            <w:tcBorders>
+              <w:top w:val="single" w:sz="6" w:color="000000"/>
+              <w:bottom w:val="single" w:sz="6" w:color="000000"/>
+            </w:tcBorders>
+          </w:tcPr>
+          <w:p>
+            <w:pPr>
+              <w:spacing w:after="0" w:line="240" w:lineRule="auto"/>
+              <w:jc w:val="center"/>
+            </w:pPr>
+            <w:r/>
+            <w:r>
+              <w:rPr>
+                <w:b/>
+                <w:sz w:val="18"/>
+              </w:rPr>
+              <w:t>Scored firms: firm-years</w:t>
+            </w:r>
+          </w:p>
+        </w:tc>
+        <w:tc>
+          <w:tcPr>
+            <w:tcW w:type="dxa" w:w="1296"/>
+            <w:tcBorders>
+              <w:top w:val="single" w:sz="6" w:color="000000"/>
+              <w:bottom w:val="single" w:sz="6" w:color="000000"/>
+            </w:tcBorders>
+          </w:tcPr>
+          <w:p>
+            <w:pPr>
+              <w:spacing w:after="0" w:line="240" w:lineRule="auto"/>
+              <w:jc w:val="center"/>
+            </w:pPr>
+            <w:r/>
+            <w:r>
+              <w:rPr>
+                <w:b/>
+                <w:sz w:val="18"/>
+              </w:rPr>
+              <w:t>Scored firms: firms</w:t>
+            </w:r>
+          </w:p>
+        </w:tc>
+        <w:tc>
+          <w:tcPr>
+            <w:tcW w:type="dxa" w:w="1440"/>
+            <w:tcBorders>
+              <w:top w:val="single" w:sz="6" w:color="000000"/>
+              <w:bottom w:val="single" w:sz="6" w:color="000000"/>
+            </w:tcBorders>
+          </w:tcPr>
+          <w:p>
+            <w:pPr>
+              <w:spacing w:after="0" w:line="240" w:lineRule="auto"/>
+              <w:jc w:val="center"/>
+            </w:pPr>
+            <w:r/>
+            <w:r>
+              <w:rPr>
+                <w:b/>
+                <w:sz w:val="18"/>
+              </w:rPr>
+              <w:t>Never-scored: firm-years</w:t>
+            </w:r>
+          </w:p>
+        </w:tc>
+        <w:tc>
+          <w:tcPr>
+            <w:tcW w:type="dxa" w:w="1296"/>
+            <w:tcBorders>
+              <w:top w:val="single" w:sz="6" w:color="000000"/>
+              <w:bottom w:val="single" w:sz="6" w:color="000000"/>
+            </w:tcBorders>
+          </w:tcPr>
+          <w:p>
+            <w:pPr>
+              <w:spacing w:after="0" w:line="240" w:lineRule="auto"/>
+              <w:jc w:val="center"/>
+            </w:pPr>
+            <w:r/>
+            <w:r>
+              <w:rPr>
+                <w:b/>
+                <w:sz w:val="18"/>
+              </w:rPr>
+              <w:t>Never-scored: firms</w:t>
+            </w:r>
+          </w:p>
+        </w:tc>
+        <w:tc>
+          <w:tcPr>
+            <w:tcW w:type="dxa" w:w="1440"/>
+            <w:tcBorders>
+              <w:top w:val="single" w:sz="6" w:color="000000"/>
+              <w:bottom w:val="single" w:sz="6" w:color="000000"/>
+            </w:tcBorders>
+          </w:tcPr>
+          <w:p>
+            <w:pPr>
+              <w:spacing w:after="0" w:line="240" w:lineRule="auto"/>
+              <w:jc w:val="center"/>
+            </w:pPr>
+            <w:r/>
+            <w:r>
+              <w:rPr>
+                <w:b/>
+                <w:sz w:val="18"/>
+              </w:rPr>
+              <w:t>Share of firm-years missing</w:t>
+            </w:r>
+          </w:p>
+        </w:tc>
+      </w:tr>
+      <w:tr>
+        <w:tc>
+          <w:tcPr>
+            <w:tcW w:type="dxa" w:w="2448"/>
+          </w:tcPr>
+          <w:p>
+            <w:pPr>
+              <w:spacing w:after="0" w:line="240" w:lineRule="auto"/>
+            </w:pPr>
+            <w:r/>
+            <w:r>
+              <w:rPr>
+                <w:sz w:val="18"/>
+              </w:rPr>
+              <w:t>ln(MTB)</w:t>
+            </w:r>
+          </w:p>
+        </w:tc>
+        <w:tc>
+          <w:tcPr>
+            <w:tcW w:type="dxa" w:w="1440"/>
+          </w:tcPr>
+          <w:p>
+            <w:pPr>
+              <w:spacing w:after="0" w:line="240" w:lineRule="auto"/>
+              <w:jc w:val="center"/>
+            </w:pPr>
+            <w:r/>
+            <w:r>
+              <w:rPr>
+                <w:sz w:val="18"/>
+              </w:rPr>
+              <w:t>6,482</w:t>
+            </w:r>
+          </w:p>
+        </w:tc>
+        <w:tc>
+          <w:tcPr>
+            <w:tcW w:type="dxa" w:w="1296"/>
+          </w:tcPr>
+          <w:p>
+            <w:pPr>
+              <w:spacing w:after="0" w:line="240" w:lineRule="auto"/>
+              <w:jc w:val="center"/>
+            </w:pPr>
+            <w:r/>
+            <w:r>
+              <w:rPr>
+                <w:sz w:val="18"/>
+              </w:rPr>
+              <w:t>674</w:t>
+            </w:r>
+          </w:p>
+        </w:tc>
+        <w:tc>
+          <w:tcPr>
+            <w:tcW w:type="dxa" w:w="1440"/>
+          </w:tcPr>
+          <w:p>
+            <w:pPr>
+              <w:spacing w:after="0" w:line="240" w:lineRule="auto"/>
+              <w:jc w:val="center"/>
+            </w:pPr>
+            <w:r/>
+            <w:r>
+              <w:rPr>
+                <w:sz w:val="18"/>
+              </w:rPr>
+              <w:t>20,706</w:t>
+            </w:r>
+          </w:p>
+        </w:tc>
+        <w:tc>
+          <w:tcPr>
+            <w:tcW w:type="dxa" w:w="1296"/>
+          </w:tcPr>
+          <w:p>
+            <w:pPr>
+              <w:spacing w:after="0" w:line="240" w:lineRule="auto"/>
+              <w:jc w:val="center"/>
+            </w:pPr>
+            <w:r/>
+            <w:r>
+              <w:rPr>
+                <w:sz w:val="18"/>
+              </w:rPr>
+              <w:t>2,552</w:t>
+            </w:r>
+          </w:p>
+        </w:tc>
+        <w:tc>
+          <w:tcPr>
+            <w:tcW w:type="dxa" w:w="1440"/>
+          </w:tcPr>
+          <w:p>
+            <w:pPr>
+              <w:spacing w:after="0" w:line="240" w:lineRule="auto"/>
+              <w:jc w:val="center"/>
+            </w:pPr>
+            <w:r/>
+            <w:r>
+              <w:rPr>
+                <w:sz w:val="18"/>
+              </w:rPr>
+              <w:t>0.248</w:t>
+            </w:r>
+          </w:p>
+        </w:tc>
+      </w:tr>
+      <w:tr>
+        <w:tc>
+          <w:tcPr>
+            <w:tcW w:type="dxa" w:w="2448"/>
+          </w:tcPr>
+          <w:p>
+            <w:pPr>
+              <w:spacing w:after="0" w:line="240" w:lineRule="auto"/>
+            </w:pPr>
+            <w:r/>
+            <w:r>
+              <w:rPr>
+                <w:sz w:val="18"/>
+              </w:rPr>
+              <w:t>ln(market capitalization)</w:t>
+            </w:r>
+          </w:p>
+        </w:tc>
+        <w:tc>
+          <w:tcPr>
+            <w:tcW w:type="dxa" w:w="1440"/>
+          </w:tcPr>
+          <w:p>
+            <w:pPr>
+              <w:spacing w:after="0" w:line="240" w:lineRule="auto"/>
+              <w:jc w:val="center"/>
+            </w:pPr>
+            <w:r/>
+            <w:r>
+              <w:rPr>
+                <w:sz w:val="18"/>
+              </w:rPr>
+              <w:t>6,710</w:t>
+            </w:r>
+          </w:p>
+        </w:tc>
+        <w:tc>
+          <w:tcPr>
+            <w:tcW w:type="dxa" w:w="1296"/>
+          </w:tcPr>
+          <w:p>
+            <w:pPr>
+              <w:spacing w:after="0" w:line="240" w:lineRule="auto"/>
+              <w:jc w:val="center"/>
+            </w:pPr>
+            <w:r/>
+            <w:r>
+              <w:rPr>
+                <w:sz w:val="18"/>
+              </w:rPr>
+              <w:t>675</w:t>
+            </w:r>
+          </w:p>
+        </w:tc>
+        <w:tc>
+          <w:tcPr>
+            <w:tcW w:type="dxa" w:w="1440"/>
+          </w:tcPr>
+          <w:p>
+            <w:pPr>
+              <w:spacing w:after="0" w:line="240" w:lineRule="auto"/>
+              <w:jc w:val="center"/>
+            </w:pPr>
+            <w:r/>
+            <w:r>
+              <w:rPr>
+                <w:sz w:val="18"/>
+              </w:rPr>
+              <w:t>22,417</w:t>
+            </w:r>
+          </w:p>
+        </w:tc>
+        <w:tc>
+          <w:tcPr>
+            <w:tcW w:type="dxa" w:w="1296"/>
+          </w:tcPr>
+          <w:p>
+            <w:pPr>
+              <w:spacing w:after="0" w:line="240" w:lineRule="auto"/>
+              <w:jc w:val="center"/>
+            </w:pPr>
+            <w:r/>
+            <w:r>
+              <w:rPr>
+                <w:sz w:val="18"/>
+              </w:rPr>
+              <w:t>2,576</w:t>
+            </w:r>
+          </w:p>
+        </w:tc>
+        <w:tc>
+          <w:tcPr>
+            <w:tcW w:type="dxa" w:w="1440"/>
+          </w:tcPr>
+          <w:p>
+            <w:pPr>
+              <w:spacing w:after="0" w:line="240" w:lineRule="auto"/>
+              <w:jc w:val="center"/>
+            </w:pPr>
+            <w:r/>
+            <w:r>
+              <w:rPr>
+                <w:sz w:val="18"/>
+              </w:rPr>
+              <w:t>0.195</w:t>
+            </w:r>
+          </w:p>
+        </w:tc>
+      </w:tr>
+      <w:tr>
+        <w:tc>
+          <w:tcPr>
+            <w:tcW w:type="dxa" w:w="2448"/>
+          </w:tcPr>
+          <w:p>
+            <w:pPr>
+              <w:spacing w:after="0" w:line="240" w:lineRule="auto"/>
+            </w:pPr>
+            <w:r/>
+            <w:r>
+              <w:rPr>
+                <w:sz w:val="18"/>
+              </w:rPr>
+              <w:t>Book leverage</w:t>
+            </w:r>
+          </w:p>
+        </w:tc>
+        <w:tc>
+          <w:tcPr>
+            <w:tcW w:type="dxa" w:w="1440"/>
+          </w:tcPr>
+          <w:p>
+            <w:pPr>
+              <w:spacing w:after="0" w:line="240" w:lineRule="auto"/>
+              <w:jc w:val="center"/>
+            </w:pPr>
+            <w:r/>
+            <w:r>
+              <w:rPr>
+                <w:sz w:val="18"/>
+              </w:rPr>
+              <w:t>6,524</w:t>
+            </w:r>
+          </w:p>
+        </w:tc>
+        <w:tc>
+          <w:tcPr>
+            <w:tcW w:type="dxa" w:w="1296"/>
+          </w:tcPr>
+          <w:p>
+            <w:pPr>
+              <w:spacing w:after="0" w:line="240" w:lineRule="auto"/>
+              <w:jc w:val="center"/>
+            </w:pPr>
+            <w:r/>
+            <w:r>
+              <w:rPr>
+                <w:sz w:val="18"/>
+              </w:rPr>
+              <w:t>672</w:t>
+            </w:r>
+          </w:p>
+        </w:tc>
+        <w:tc>
+          <w:tcPr>
+            <w:tcW w:type="dxa" w:w="1440"/>
+          </w:tcPr>
+          <w:p>
+            <w:pPr>
+              <w:spacing w:after="0" w:line="240" w:lineRule="auto"/>
+              <w:jc w:val="center"/>
+            </w:pPr>
+            <w:r/>
+            <w:r>
+              <w:rPr>
+                <w:sz w:val="18"/>
+              </w:rPr>
+              <w:t>22,333</w:t>
+            </w:r>
+          </w:p>
+        </w:tc>
+        <w:tc>
+          <w:tcPr>
+            <w:tcW w:type="dxa" w:w="1296"/>
+          </w:tcPr>
+          <w:p>
+            <w:pPr>
+              <w:spacing w:after="0" w:line="240" w:lineRule="auto"/>
+              <w:jc w:val="center"/>
+            </w:pPr>
+            <w:r/>
+            <w:r>
+              <w:rPr>
+                <w:sz w:val="18"/>
+              </w:rPr>
+              <w:t>2,547</w:t>
+            </w:r>
+          </w:p>
+        </w:tc>
+        <w:tc>
+          <w:tcPr>
+            <w:tcW w:type="dxa" w:w="1440"/>
+          </w:tcPr>
+          <w:p>
+            <w:pPr>
+              <w:spacing w:after="0" w:line="240" w:lineRule="auto"/>
+              <w:jc w:val="center"/>
+            </w:pPr>
+            <w:r/>
+            <w:r>
+              <w:rPr>
+                <w:sz w:val="18"/>
+              </w:rPr>
+              <w:t>0.202</w:t>
+            </w:r>
+          </w:p>
+        </w:tc>
+      </w:tr>
+      <w:tr>
+        <w:tc>
+          <w:tcPr>
+            <w:tcW w:type="dxa" w:w="2448"/>
+            <w:tcBorders>
+              <w:bottom w:val="single" w:sz="6" w:color="000000"/>
+            </w:tcBorders>
+          </w:tcPr>
+          <w:p>
+            <w:pPr>
+              <w:spacing w:after="0" w:line="240" w:lineRule="auto"/>
+            </w:pPr>
+            <w:r/>
+            <w:r>
+              <w:rPr>
+                <w:sz w:val="18"/>
+              </w:rPr>
+              <w:t>ln(total assets)</w:t>
+            </w:r>
+          </w:p>
+        </w:tc>
+        <w:tc>
+          <w:tcPr>
+            <w:tcW w:type="dxa" w:w="1440"/>
+            <w:tcBorders>
+              <w:bottom w:val="single" w:sz="6" w:color="000000"/>
+            </w:tcBorders>
+          </w:tcPr>
+          <w:p>
+            <w:pPr>
+              <w:spacing w:after="0" w:line="240" w:lineRule="auto"/>
+              <w:jc w:val="center"/>
+            </w:pPr>
+            <w:r/>
+            <w:r>
+              <w:rPr>
+                <w:sz w:val="18"/>
+              </w:rPr>
+              <w:t>6,916</w:t>
+            </w:r>
+          </w:p>
+        </w:tc>
+        <w:tc>
+          <w:tcPr>
+            <w:tcW w:type="dxa" w:w="1296"/>
+            <w:tcBorders>
+              <w:bottom w:val="single" w:sz="6" w:color="000000"/>
+            </w:tcBorders>
+          </w:tcPr>
+          <w:p>
+            <w:pPr>
+              <w:spacing w:after="0" w:line="240" w:lineRule="auto"/>
+              <w:jc w:val="center"/>
+            </w:pPr>
+            <w:r/>
+            <w:r>
+              <w:rPr>
+                <w:sz w:val="18"/>
+              </w:rPr>
+              <w:t>675</w:t>
+            </w:r>
+          </w:p>
+        </w:tc>
+        <w:tc>
+          <w:tcPr>
+            <w:tcW w:type="dxa" w:w="1440"/>
+            <w:tcBorders>
+              <w:bottom w:val="single" w:sz="6" w:color="000000"/>
+            </w:tcBorders>
+          </w:tcPr>
+          <w:p>
+            <w:pPr>
+              <w:spacing w:after="0" w:line="240" w:lineRule="auto"/>
+              <w:jc w:val="center"/>
+            </w:pPr>
+            <w:r/>
+            <w:r>
+              <w:rPr>
+                <w:sz w:val="18"/>
+              </w:rPr>
+              <w:t>24,814</w:t>
+            </w:r>
+          </w:p>
+        </w:tc>
+        <w:tc>
+          <w:tcPr>
+            <w:tcW w:type="dxa" w:w="1296"/>
+            <w:tcBorders>
+              <w:bottom w:val="single" w:sz="6" w:color="000000"/>
+            </w:tcBorders>
+          </w:tcPr>
+          <w:p>
+            <w:pPr>
+              <w:spacing w:after="0" w:line="240" w:lineRule="auto"/>
+              <w:jc w:val="center"/>
+            </w:pPr>
+            <w:r/>
+            <w:r>
+              <w:rPr>
+                <w:sz w:val="18"/>
+              </w:rPr>
+              <w:t>2,611</w:t>
+            </w:r>
+          </w:p>
+        </w:tc>
+        <w:tc>
+          <w:tcPr>
+            <w:tcW w:type="dxa" w:w="1440"/>
+            <w:tcBorders>
+              <w:bottom w:val="single" w:sz="6" w:color="000000"/>
+            </w:tcBorders>
+          </w:tcPr>
+          <w:p>
+            <w:pPr>
+              <w:spacing w:after="0" w:line="240" w:lineRule="auto"/>
+              <w:jc w:val="center"/>
+            </w:pPr>
+            <w:r/>
+            <w:r>
+              <w:rPr>
+                <w:sz w:val="18"/>
+              </w:rPr>
+              <w:t>0.123</w:t>
+            </w:r>
+          </w:p>
+        </w:tc>
+      </w:tr>
+    </w:tbl>
+    <w:p>
+      <w:pPr>
+        <w:spacing w:line="240" w:lineRule="auto" w:after="40" w:before="0"/>
+      </w:pPr>
+      <w:r>
+        <w:rPr>
+          <w:sz w:val="20"/>
+        </w:rPr>
+        <w:t>Counts refer to the estimation sample after winsorization; the last column is the share of estimation firm-years with a missing value of the outcome.</w:t>
+      </w:r>
+    </w:p>
+    <w:p>
+      <w:pPr>
+        <w:spacing w:line="240" w:lineRule="auto" w:after="40" w:before="0"/>
+      </w:pPr>
+      <w:r>
+        <w:rPr>
+          <w:sz w:val="20"/>
+        </w:rPr>
+        <w:t>Source: Authors' calculations from LSEG ESG scores and Compustat Global.</w:t>
+      </w:r>
+    </w:p>
+    <w:p>
+      <w:r>
+        <w:br w:type="page"/>
+      </w:r>
+    </w:p>
+    <w:p>
+      <w:pPr>
+        <w:spacing w:line="240" w:lineRule="auto" w:after="120" w:before="0"/>
+      </w:pPr>
+      <w:r>
+        <w:rPr>
+          <w:b/>
+        </w:rPr>
+        <w:t>Table IA5</w:t>
+      </w:r>
+      <w:r>
+        <w:t xml:space="preserve"> </w:t>
+      </w:r>
+      <w:r>
+        <w:rPr/>
+        <w:t>Relative-magnitude bounds for the average effect of the first LSEG ESG score</w:t>
+      </w:r>
+    </w:p>
+    <w:tbl>
+      <w:tblPr>
+        <w:tblW w:type="auto" w:w="0"/>
+        <w:jc w:val="center"/>
+        <w:tblLayout w:type="fixed"/>
+        <w:tblLook w:firstColumn="1" w:firstRow="1" w:lastColumn="0" w:lastRow="0" w:noHBand="0" w:noVBand="1" w:val="04A0"/>
+        <w:tblLayout w:type="fixed"/>
+      </w:tblPr>
+      <w:tblGrid>
+        <w:gridCol w:w="2448"/>
+        <w:gridCol w:w="864"/>
+        <w:gridCol w:w="1728"/>
+        <w:gridCol w:w="1296"/>
+        <w:gridCol w:w="2304"/>
+      </w:tblGrid>
+      <w:tr>
+        <w:tc>
+          <w:tcPr>
+            <w:tcW w:type="dxa" w:w="2448"/>
+            <w:tcBorders>
+              <w:top w:val="single" w:sz="6" w:color="000000"/>
+              <w:bottom w:val="single" w:sz="6" w:color="000000"/>
+            </w:tcBorders>
+          </w:tcPr>
+          <w:p>
+            <w:pPr>
+              <w:spacing w:after="0" w:line="240" w:lineRule="auto"/>
+            </w:pPr>
+            <w:r/>
+            <w:r>
+              <w:rPr>
+                <w:b/>
+                <w:sz w:val="18"/>
+              </w:rPr>
+              <w:t>Outcome</w:t>
+            </w:r>
+          </w:p>
+        </w:tc>
+        <w:tc>
+          <w:tcPr>
+            <w:tcW w:type="dxa" w:w="864"/>
+            <w:tcBorders>
+              <w:top w:val="single" w:sz="6" w:color="000000"/>
+              <w:bottom w:val="single" w:sz="6" w:color="000000"/>
+            </w:tcBorders>
+          </w:tcPr>
+          <w:p>
+            <w:pPr>
+              <w:spacing w:after="0" w:line="240" w:lineRule="auto"/>
+              <w:jc w:val="center"/>
+            </w:pPr>
+            <w:r/>
+            <w:r>
+              <w:rPr>
+                <w:b/>
+                <w:sz w:val="18"/>
+              </w:rPr>
+              <w:t>M̄</w:t>
+            </w:r>
+          </w:p>
+        </w:tc>
+        <w:tc>
+          <w:tcPr>
+            <w:tcW w:type="dxa" w:w="1728"/>
+            <w:tcBorders>
+              <w:top w:val="single" w:sz="6" w:color="000000"/>
+              <w:bottom w:val="single" w:sz="6" w:color="000000"/>
+            </w:tcBorders>
+          </w:tcPr>
+          <w:p>
+            <w:pPr>
+              <w:spacing w:after="0" w:line="240" w:lineRule="auto"/>
+              <w:jc w:val="center"/>
+            </w:pPr>
+            <w:r/>
+            <w:r>
+              <w:rPr>
+                <w:b/>
+                <w:sz w:val="18"/>
+              </w:rPr>
+              <w:t>Largest pre-period change</w:t>
+            </w:r>
+          </w:p>
+        </w:tc>
+        <w:tc>
+          <w:tcPr>
+            <w:tcW w:type="dxa" w:w="1296"/>
+            <w:tcBorders>
+              <w:top w:val="single" w:sz="6" w:color="000000"/>
+              <w:bottom w:val="single" w:sz="6" w:color="000000"/>
+            </w:tcBorders>
+          </w:tcPr>
+          <w:p>
+            <w:pPr>
+              <w:spacing w:after="0" w:line="240" w:lineRule="auto"/>
+              <w:jc w:val="center"/>
+            </w:pPr>
+            <w:r/>
+            <w:r>
+              <w:rPr>
+                <w:b/>
+                <w:sz w:val="18"/>
+              </w:rPr>
+              <w:t>Bias bound</w:t>
+            </w:r>
+          </w:p>
+        </w:tc>
+        <w:tc>
+          <w:tcPr>
+            <w:tcW w:type="dxa" w:w="2304"/>
+            <w:tcBorders>
+              <w:top w:val="single" w:sz="6" w:color="000000"/>
+              <w:bottom w:val="single" w:sz="6" w:color="000000"/>
+            </w:tcBorders>
+          </w:tcPr>
+          <w:p>
+            <w:pPr>
+              <w:spacing w:after="0" w:line="240" w:lineRule="auto"/>
+              <w:jc w:val="center"/>
+            </w:pPr>
+            <w:r/>
+            <w:r>
+              <w:rPr>
+                <w:b/>
+                <w:sz w:val="18"/>
+              </w:rPr>
+              <w:t>Robust 95% interval</w:t>
+            </w:r>
+          </w:p>
+        </w:tc>
+      </w:tr>
+      <w:tr>
+        <w:tc>
+          <w:tcPr>
+            <w:tcW w:type="dxa" w:w="2448"/>
+          </w:tcPr>
+          <w:p>
+            <w:pPr>
+              <w:spacing w:after="0" w:line="240" w:lineRule="auto"/>
+            </w:pPr>
+            <w:r/>
+            <w:r>
+              <w:rPr>
+                <w:sz w:val="18"/>
+              </w:rPr>
+              <w:t>ln(MTB)</w:t>
+            </w:r>
+          </w:p>
+        </w:tc>
+        <w:tc>
+          <w:tcPr>
+            <w:tcW w:type="dxa" w:w="864"/>
+          </w:tcPr>
+          <w:p>
+            <w:pPr>
+              <w:spacing w:after="0" w:line="240" w:lineRule="auto"/>
+              <w:jc w:val="center"/>
+            </w:pPr>
+            <w:r/>
+            <w:r>
+              <w:rPr>
+                <w:sz w:val="18"/>
+              </w:rPr>
+              <w:t>0.00</w:t>
+            </w:r>
+          </w:p>
+        </w:tc>
+        <w:tc>
+          <w:tcPr>
+            <w:tcW w:type="dxa" w:w="1728"/>
+          </w:tcPr>
+          <w:p>
+            <w:pPr>
+              <w:spacing w:after="0" w:line="240" w:lineRule="auto"/>
+              <w:jc w:val="center"/>
+            </w:pPr>
+            <w:r/>
+            <w:r>
+              <w:rPr>
+                <w:sz w:val="18"/>
+              </w:rPr>
+              <w:t>0.046</w:t>
+            </w:r>
+          </w:p>
+        </w:tc>
+        <w:tc>
+          <w:tcPr>
+            <w:tcW w:type="dxa" w:w="1296"/>
+          </w:tcPr>
+          <w:p>
+            <w:pPr>
+              <w:spacing w:after="0" w:line="240" w:lineRule="auto"/>
+              <w:jc w:val="center"/>
+            </w:pPr>
+            <w:r/>
+            <w:r>
+              <w:rPr>
+                <w:sz w:val="18"/>
+              </w:rPr>
+              <w:t>0.000</w:t>
+            </w:r>
+          </w:p>
+        </w:tc>
+        <w:tc>
+          <w:tcPr>
+            <w:tcW w:type="dxa" w:w="2304"/>
+          </w:tcPr>
+          <w:p>
+            <w:pPr>
+              <w:spacing w:after="0" w:line="240" w:lineRule="auto"/>
+              <w:jc w:val="center"/>
+            </w:pPr>
+            <w:r/>
+            <w:r>
+              <w:rPr>
+                <w:sz w:val="18"/>
+              </w:rPr>
+              <w:t>[−0.046, 0.048]</w:t>
+            </w:r>
+          </w:p>
+        </w:tc>
+      </w:tr>
+      <w:tr>
+        <w:tc>
+          <w:tcPr>
+            <w:tcW w:type="dxa" w:w="2448"/>
+          </w:tcPr>
+          <w:p>
+            <w:pPr>
+              <w:spacing w:after="0" w:line="240" w:lineRule="auto"/>
+            </w:pPr>
+            <w:r/>
+            <w:r>
+              <w:rPr>
+                <w:sz w:val="18"/>
+              </w:rPr>
+              <w:t>ln(MTB)</w:t>
+            </w:r>
+          </w:p>
+        </w:tc>
+        <w:tc>
+          <w:tcPr>
+            <w:tcW w:type="dxa" w:w="864"/>
+          </w:tcPr>
+          <w:p>
+            <w:pPr>
+              <w:spacing w:after="0" w:line="240" w:lineRule="auto"/>
+              <w:jc w:val="center"/>
+            </w:pPr>
+            <w:r/>
+            <w:r>
+              <w:rPr>
+                <w:sz w:val="18"/>
+              </w:rPr>
+              <w:t>0.25</w:t>
+            </w:r>
+          </w:p>
+        </w:tc>
+        <w:tc>
+          <w:tcPr>
+            <w:tcW w:type="dxa" w:w="1728"/>
+          </w:tcPr>
+          <w:p>
+            <w:pPr>
+              <w:spacing w:after="0" w:line="240" w:lineRule="auto"/>
+              <w:jc w:val="center"/>
+            </w:pPr>
+            <w:r/>
+            <w:r>
+              <w:rPr>
+                <w:sz w:val="18"/>
+              </w:rPr>
+              <w:t>0.046</w:t>
+            </w:r>
+          </w:p>
+        </w:tc>
+        <w:tc>
+          <w:tcPr>
+            <w:tcW w:type="dxa" w:w="1296"/>
+          </w:tcPr>
+          <w:p>
+            <w:pPr>
+              <w:spacing w:after="0" w:line="240" w:lineRule="auto"/>
+              <w:jc w:val="center"/>
+            </w:pPr>
+            <w:r/>
+            <w:r>
+              <w:rPr>
+                <w:sz w:val="18"/>
+              </w:rPr>
+              <w:t>0.025</w:t>
+            </w:r>
+          </w:p>
+        </w:tc>
+        <w:tc>
+          <w:tcPr>
+            <w:tcW w:type="dxa" w:w="2304"/>
+          </w:tcPr>
+          <w:p>
+            <w:pPr>
+              <w:spacing w:after="0" w:line="240" w:lineRule="auto"/>
+              <w:jc w:val="center"/>
+            </w:pPr>
+            <w:r/>
+            <w:r>
+              <w:rPr>
+                <w:sz w:val="18"/>
+              </w:rPr>
+              <w:t>[−0.071, 0.073]</w:t>
+            </w:r>
+          </w:p>
+        </w:tc>
+      </w:tr>
+      <w:tr>
+        <w:tc>
+          <w:tcPr>
+            <w:tcW w:type="dxa" w:w="2448"/>
+          </w:tcPr>
+          <w:p>
+            <w:pPr>
+              <w:spacing w:after="0" w:line="240" w:lineRule="auto"/>
+            </w:pPr>
+            <w:r/>
+            <w:r>
+              <w:rPr>
+                <w:sz w:val="18"/>
+              </w:rPr>
+              <w:t>ln(MTB)</w:t>
+            </w:r>
+          </w:p>
+        </w:tc>
+        <w:tc>
+          <w:tcPr>
+            <w:tcW w:type="dxa" w:w="864"/>
+          </w:tcPr>
+          <w:p>
+            <w:pPr>
+              <w:spacing w:after="0" w:line="240" w:lineRule="auto"/>
+              <w:jc w:val="center"/>
+            </w:pPr>
+            <w:r/>
+            <w:r>
+              <w:rPr>
+                <w:sz w:val="18"/>
+              </w:rPr>
+              <w:t>0.50</w:t>
+            </w:r>
+          </w:p>
+        </w:tc>
+        <w:tc>
+          <w:tcPr>
+            <w:tcW w:type="dxa" w:w="1728"/>
+          </w:tcPr>
+          <w:p>
+            <w:pPr>
+              <w:spacing w:after="0" w:line="240" w:lineRule="auto"/>
+              <w:jc w:val="center"/>
+            </w:pPr>
+            <w:r/>
+            <w:r>
+              <w:rPr>
+                <w:sz w:val="18"/>
+              </w:rPr>
+              <w:t>0.046</w:t>
+            </w:r>
+          </w:p>
+        </w:tc>
+        <w:tc>
+          <w:tcPr>
+            <w:tcW w:type="dxa" w:w="1296"/>
+          </w:tcPr>
+          <w:p>
+            <w:pPr>
+              <w:spacing w:after="0" w:line="240" w:lineRule="auto"/>
+              <w:jc w:val="center"/>
+            </w:pPr>
+            <w:r/>
+            <w:r>
+              <w:rPr>
+                <w:sz w:val="18"/>
+              </w:rPr>
+              <w:t>0.050</w:t>
+            </w:r>
+          </w:p>
+        </w:tc>
+        <w:tc>
+          <w:tcPr>
+            <w:tcW w:type="dxa" w:w="2304"/>
+          </w:tcPr>
+          <w:p>
+            <w:pPr>
+              <w:spacing w:after="0" w:line="240" w:lineRule="auto"/>
+              <w:jc w:val="center"/>
+            </w:pPr>
+            <w:r/>
+            <w:r>
+              <w:rPr>
+                <w:sz w:val="18"/>
+              </w:rPr>
+              <w:t>[−0.096, 0.098]</w:t>
+            </w:r>
+          </w:p>
+        </w:tc>
+      </w:tr>
+      <w:tr>
+        <w:tc>
+          <w:tcPr>
+            <w:tcW w:type="dxa" w:w="2448"/>
+          </w:tcPr>
+          <w:p>
+            <w:pPr>
+              <w:spacing w:after="0" w:line="240" w:lineRule="auto"/>
+            </w:pPr>
+            <w:r/>
+            <w:r>
+              <w:rPr>
+                <w:sz w:val="18"/>
+              </w:rPr>
+              <w:t>ln(MTB)</w:t>
+            </w:r>
+          </w:p>
+        </w:tc>
+        <w:tc>
+          <w:tcPr>
+            <w:tcW w:type="dxa" w:w="864"/>
+          </w:tcPr>
+          <w:p>
+            <w:pPr>
+              <w:spacing w:after="0" w:line="240" w:lineRule="auto"/>
+              <w:jc w:val="center"/>
+            </w:pPr>
+            <w:r/>
+            <w:r>
+              <w:rPr>
+                <w:sz w:val="18"/>
+              </w:rPr>
+              <w:t>1.00</w:t>
+            </w:r>
+          </w:p>
+        </w:tc>
+        <w:tc>
+          <w:tcPr>
+            <w:tcW w:type="dxa" w:w="1728"/>
+          </w:tcPr>
+          <w:p>
+            <w:pPr>
+              <w:spacing w:after="0" w:line="240" w:lineRule="auto"/>
+              <w:jc w:val="center"/>
+            </w:pPr>
+            <w:r/>
+            <w:r>
+              <w:rPr>
+                <w:sz w:val="18"/>
+              </w:rPr>
+              <w:t>0.046</w:t>
+            </w:r>
+          </w:p>
+        </w:tc>
+        <w:tc>
+          <w:tcPr>
+            <w:tcW w:type="dxa" w:w="1296"/>
+          </w:tcPr>
+          <w:p>
+            <w:pPr>
+              <w:spacing w:after="0" w:line="240" w:lineRule="auto"/>
+              <w:jc w:val="center"/>
+            </w:pPr>
+            <w:r/>
+            <w:r>
+              <w:rPr>
+                <w:sz w:val="18"/>
+              </w:rPr>
+              <w:t>0.101</w:t>
+            </w:r>
+          </w:p>
+        </w:tc>
+        <w:tc>
+          <w:tcPr>
+            <w:tcW w:type="dxa" w:w="2304"/>
+          </w:tcPr>
+          <w:p>
+            <w:pPr>
+              <w:spacing w:after="0" w:line="240" w:lineRule="auto"/>
+              <w:jc w:val="center"/>
+            </w:pPr>
+            <w:r/>
+            <w:r>
+              <w:rPr>
+                <w:sz w:val="18"/>
+              </w:rPr>
+              <w:t>[−0.147, 0.148]</w:t>
+            </w:r>
+          </w:p>
+        </w:tc>
+      </w:tr>
+      <w:tr>
+        <w:tc>
+          <w:tcPr>
+            <w:tcW w:type="dxa" w:w="2448"/>
+          </w:tcPr>
+          <w:p>
+            <w:pPr>
+              <w:spacing w:after="0" w:line="240" w:lineRule="auto"/>
+            </w:pPr>
+            <w:r/>
+            <w:r>
+              <w:rPr>
+                <w:sz w:val="18"/>
+              </w:rPr>
+              <w:t>ln(market capitalization)</w:t>
+            </w:r>
+          </w:p>
+        </w:tc>
+        <w:tc>
+          <w:tcPr>
+            <w:tcW w:type="dxa" w:w="864"/>
+          </w:tcPr>
+          <w:p>
+            <w:pPr>
+              <w:spacing w:after="0" w:line="240" w:lineRule="auto"/>
+              <w:jc w:val="center"/>
+            </w:pPr>
+            <w:r/>
+            <w:r>
+              <w:rPr>
+                <w:sz w:val="18"/>
+              </w:rPr>
+              <w:t>0.00</w:t>
+            </w:r>
+          </w:p>
+        </w:tc>
+        <w:tc>
+          <w:tcPr>
+            <w:tcW w:type="dxa" w:w="1728"/>
+          </w:tcPr>
+          <w:p>
+            <w:pPr>
+              <w:spacing w:after="0" w:line="240" w:lineRule="auto"/>
+              <w:jc w:val="center"/>
+            </w:pPr>
+            <w:r/>
+            <w:r>
+              <w:rPr>
+                <w:sz w:val="18"/>
+              </w:rPr>
+              <w:t>0.063</w:t>
+            </w:r>
+          </w:p>
+        </w:tc>
+        <w:tc>
+          <w:tcPr>
+            <w:tcW w:type="dxa" w:w="1296"/>
+          </w:tcPr>
+          <w:p>
+            <w:pPr>
+              <w:spacing w:after="0" w:line="240" w:lineRule="auto"/>
+              <w:jc w:val="center"/>
+            </w:pPr>
+            <w:r/>
+            <w:r>
+              <w:rPr>
+                <w:sz w:val="18"/>
+              </w:rPr>
+              <w:t>0.000</w:t>
+            </w:r>
+          </w:p>
+        </w:tc>
+        <w:tc>
+          <w:tcPr>
+            <w:tcW w:type="dxa" w:w="2304"/>
+          </w:tcPr>
+          <w:p>
+            <w:pPr>
+              <w:spacing w:after="0" w:line="240" w:lineRule="auto"/>
+              <w:jc w:val="center"/>
+            </w:pPr>
+            <w:r/>
+            <w:r>
+              <w:rPr>
+                <w:sz w:val="18"/>
+              </w:rPr>
+              <w:t>[−0.109, 0.003]</w:t>
+            </w:r>
+          </w:p>
+        </w:tc>
+      </w:tr>
+      <w:tr>
+        <w:tc>
+          <w:tcPr>
+            <w:tcW w:type="dxa" w:w="2448"/>
+          </w:tcPr>
+          <w:p>
+            <w:pPr>
+              <w:spacing w:after="0" w:line="240" w:lineRule="auto"/>
+            </w:pPr>
+            <w:r/>
+            <w:r>
+              <w:rPr>
+                <w:sz w:val="18"/>
+              </w:rPr>
+              <w:t>ln(market capitalization)</w:t>
+            </w:r>
+          </w:p>
+        </w:tc>
+        <w:tc>
+          <w:tcPr>
+            <w:tcW w:type="dxa" w:w="864"/>
+          </w:tcPr>
+          <w:p>
+            <w:pPr>
+              <w:spacing w:after="0" w:line="240" w:lineRule="auto"/>
+              <w:jc w:val="center"/>
+            </w:pPr>
+            <w:r/>
+            <w:r>
+              <w:rPr>
+                <w:sz w:val="18"/>
+              </w:rPr>
+              <w:t>0.25</w:t>
+            </w:r>
+          </w:p>
+        </w:tc>
+        <w:tc>
+          <w:tcPr>
+            <w:tcW w:type="dxa" w:w="1728"/>
+          </w:tcPr>
+          <w:p>
+            <w:pPr>
+              <w:spacing w:after="0" w:line="240" w:lineRule="auto"/>
+              <w:jc w:val="center"/>
+            </w:pPr>
+            <w:r/>
+            <w:r>
+              <w:rPr>
+                <w:sz w:val="18"/>
+              </w:rPr>
+              <w:t>0.063</w:t>
+            </w:r>
+          </w:p>
+        </w:tc>
+        <w:tc>
+          <w:tcPr>
+            <w:tcW w:type="dxa" w:w="1296"/>
+          </w:tcPr>
+          <w:p>
+            <w:pPr>
+              <w:spacing w:after="0" w:line="240" w:lineRule="auto"/>
+              <w:jc w:val="center"/>
+            </w:pPr>
+            <w:r/>
+            <w:r>
+              <w:rPr>
+                <w:sz w:val="18"/>
+              </w:rPr>
+              <w:t>0.035</w:t>
+            </w:r>
+          </w:p>
+        </w:tc>
+        <w:tc>
+          <w:tcPr>
+            <w:tcW w:type="dxa" w:w="2304"/>
+          </w:tcPr>
+          <w:p>
+            <w:pPr>
+              <w:spacing w:after="0" w:line="240" w:lineRule="auto"/>
+              <w:jc w:val="center"/>
+            </w:pPr>
+            <w:r/>
+            <w:r>
+              <w:rPr>
+                <w:sz w:val="18"/>
+              </w:rPr>
+              <w:t>[−0.144, 0.038]</w:t>
+            </w:r>
+          </w:p>
+        </w:tc>
+      </w:tr>
+      <w:tr>
+        <w:tc>
+          <w:tcPr>
+            <w:tcW w:type="dxa" w:w="2448"/>
+          </w:tcPr>
+          <w:p>
+            <w:pPr>
+              <w:spacing w:after="0" w:line="240" w:lineRule="auto"/>
+            </w:pPr>
+            <w:r/>
+            <w:r>
+              <w:rPr>
+                <w:sz w:val="18"/>
+              </w:rPr>
+              <w:t>ln(market capitalization)</w:t>
+            </w:r>
+          </w:p>
+        </w:tc>
+        <w:tc>
+          <w:tcPr>
+            <w:tcW w:type="dxa" w:w="864"/>
+          </w:tcPr>
+          <w:p>
+            <w:pPr>
+              <w:spacing w:after="0" w:line="240" w:lineRule="auto"/>
+              <w:jc w:val="center"/>
+            </w:pPr>
+            <w:r/>
+            <w:r>
+              <w:rPr>
+                <w:sz w:val="18"/>
+              </w:rPr>
+              <w:t>0.50</w:t>
+            </w:r>
+          </w:p>
+        </w:tc>
+        <w:tc>
+          <w:tcPr>
+            <w:tcW w:type="dxa" w:w="1728"/>
+          </w:tcPr>
+          <w:p>
+            <w:pPr>
+              <w:spacing w:after="0" w:line="240" w:lineRule="auto"/>
+              <w:jc w:val="center"/>
+            </w:pPr>
+            <w:r/>
+            <w:r>
+              <w:rPr>
+                <w:sz w:val="18"/>
+              </w:rPr>
+              <w:t>0.063</w:t>
+            </w:r>
+          </w:p>
+        </w:tc>
+        <w:tc>
+          <w:tcPr>
+            <w:tcW w:type="dxa" w:w="1296"/>
+          </w:tcPr>
+          <w:p>
+            <w:pPr>
+              <w:spacing w:after="0" w:line="240" w:lineRule="auto"/>
+              <w:jc w:val="center"/>
+            </w:pPr>
+            <w:r/>
+            <w:r>
+              <w:rPr>
+                <w:sz w:val="18"/>
+              </w:rPr>
+              <w:t>0.070</w:t>
+            </w:r>
+          </w:p>
+        </w:tc>
+        <w:tc>
+          <w:tcPr>
+            <w:tcW w:type="dxa" w:w="2304"/>
+          </w:tcPr>
+          <w:p>
+            <w:pPr>
+              <w:spacing w:after="0" w:line="240" w:lineRule="auto"/>
+              <w:jc w:val="center"/>
+            </w:pPr>
+            <w:r/>
+            <w:r>
+              <w:rPr>
+                <w:sz w:val="18"/>
+              </w:rPr>
+              <w:t>[−0.179, 0.073]</w:t>
+            </w:r>
+          </w:p>
+        </w:tc>
+      </w:tr>
+      <w:tr>
+        <w:tc>
+          <w:tcPr>
+            <w:tcW w:type="dxa" w:w="2448"/>
+          </w:tcPr>
+          <w:p>
+            <w:pPr>
+              <w:spacing w:after="0" w:line="240" w:lineRule="auto"/>
+            </w:pPr>
+            <w:r/>
+            <w:r>
+              <w:rPr>
+                <w:sz w:val="18"/>
+              </w:rPr>
+              <w:t>ln(market capitalization)</w:t>
+            </w:r>
+          </w:p>
+        </w:tc>
+        <w:tc>
+          <w:tcPr>
+            <w:tcW w:type="dxa" w:w="864"/>
+          </w:tcPr>
+          <w:p>
+            <w:pPr>
+              <w:spacing w:after="0" w:line="240" w:lineRule="auto"/>
+              <w:jc w:val="center"/>
+            </w:pPr>
+            <w:r/>
+            <w:r>
+              <w:rPr>
+                <w:sz w:val="18"/>
+              </w:rPr>
+              <w:t>1.00</w:t>
+            </w:r>
+          </w:p>
+        </w:tc>
+        <w:tc>
+          <w:tcPr>
+            <w:tcW w:type="dxa" w:w="1728"/>
+          </w:tcPr>
+          <w:p>
+            <w:pPr>
+              <w:spacing w:after="0" w:line="240" w:lineRule="auto"/>
+              <w:jc w:val="center"/>
+            </w:pPr>
+            <w:r/>
+            <w:r>
+              <w:rPr>
+                <w:sz w:val="18"/>
+              </w:rPr>
+              <w:t>0.063</w:t>
+            </w:r>
+          </w:p>
+        </w:tc>
+        <w:tc>
+          <w:tcPr>
+            <w:tcW w:type="dxa" w:w="1296"/>
+          </w:tcPr>
+          <w:p>
+            <w:pPr>
+              <w:spacing w:after="0" w:line="240" w:lineRule="auto"/>
+              <w:jc w:val="center"/>
+            </w:pPr>
+            <w:r/>
+            <w:r>
+              <w:rPr>
+                <w:sz w:val="18"/>
+              </w:rPr>
+              <w:t>0.140</w:t>
+            </w:r>
+          </w:p>
+        </w:tc>
+        <w:tc>
+          <w:tcPr>
+            <w:tcW w:type="dxa" w:w="2304"/>
+          </w:tcPr>
+          <w:p>
+            <w:pPr>
+              <w:spacing w:after="0" w:line="240" w:lineRule="auto"/>
+              <w:jc w:val="center"/>
+            </w:pPr>
+            <w:r/>
+            <w:r>
+              <w:rPr>
+                <w:sz w:val="18"/>
+              </w:rPr>
+              <w:t>[−0.249, 0.143]</w:t>
+            </w:r>
+          </w:p>
+        </w:tc>
+      </w:tr>
+      <w:tr>
+        <w:tc>
+          <w:tcPr>
+            <w:tcW w:type="dxa" w:w="2448"/>
+          </w:tcPr>
+          <w:p>
+            <w:pPr>
+              <w:spacing w:after="0" w:line="240" w:lineRule="auto"/>
+            </w:pPr>
+            <w:r/>
+            <w:r>
+              <w:rPr>
+                <w:sz w:val="18"/>
+              </w:rPr>
+              <w:t>Book leverage</w:t>
+            </w:r>
+          </w:p>
+        </w:tc>
+        <w:tc>
+          <w:tcPr>
+            <w:tcW w:type="dxa" w:w="864"/>
+          </w:tcPr>
+          <w:p>
+            <w:pPr>
+              <w:spacing w:after="0" w:line="240" w:lineRule="auto"/>
+              <w:jc w:val="center"/>
+            </w:pPr>
+            <w:r/>
+            <w:r>
+              <w:rPr>
+                <w:sz w:val="18"/>
+              </w:rPr>
+              <w:t>0.00</w:t>
+            </w:r>
+          </w:p>
+        </w:tc>
+        <w:tc>
+          <w:tcPr>
+            <w:tcW w:type="dxa" w:w="1728"/>
+          </w:tcPr>
+          <w:p>
+            <w:pPr>
+              <w:spacing w:after="0" w:line="240" w:lineRule="auto"/>
+              <w:jc w:val="center"/>
+            </w:pPr>
+            <w:r/>
+            <w:r>
+              <w:rPr>
+                <w:sz w:val="18"/>
+              </w:rPr>
+              <w:t>0.012</w:t>
+            </w:r>
+          </w:p>
+        </w:tc>
+        <w:tc>
+          <w:tcPr>
+            <w:tcW w:type="dxa" w:w="1296"/>
+          </w:tcPr>
+          <w:p>
+            <w:pPr>
+              <w:spacing w:after="0" w:line="240" w:lineRule="auto"/>
+              <w:jc w:val="center"/>
+            </w:pPr>
+            <w:r/>
+            <w:r>
+              <w:rPr>
+                <w:sz w:val="18"/>
+              </w:rPr>
+              <w:t>0.000</w:t>
+            </w:r>
+          </w:p>
+        </w:tc>
+        <w:tc>
+          <w:tcPr>
+            <w:tcW w:type="dxa" w:w="2304"/>
+          </w:tcPr>
+          <w:p>
+            <w:pPr>
+              <w:spacing w:after="0" w:line="240" w:lineRule="auto"/>
+              <w:jc w:val="center"/>
+            </w:pPr>
+            <w:r/>
+            <w:r>
+              <w:rPr>
+                <w:sz w:val="18"/>
+              </w:rPr>
+              <w:t>[−0.001, 0.018]</w:t>
+            </w:r>
+          </w:p>
+        </w:tc>
+      </w:tr>
+      <w:tr>
+        <w:tc>
+          <w:tcPr>
+            <w:tcW w:type="dxa" w:w="2448"/>
+          </w:tcPr>
+          <w:p>
+            <w:pPr>
+              <w:spacing w:after="0" w:line="240" w:lineRule="auto"/>
+            </w:pPr>
+            <w:r/>
+            <w:r>
+              <w:rPr>
+                <w:sz w:val="18"/>
+              </w:rPr>
+              <w:t>Book leverage</w:t>
+            </w:r>
+          </w:p>
+        </w:tc>
+        <w:tc>
+          <w:tcPr>
+            <w:tcW w:type="dxa" w:w="864"/>
+          </w:tcPr>
+          <w:p>
+            <w:pPr>
+              <w:spacing w:after="0" w:line="240" w:lineRule="auto"/>
+              <w:jc w:val="center"/>
+            </w:pPr>
+            <w:r/>
+            <w:r>
+              <w:rPr>
+                <w:sz w:val="18"/>
+              </w:rPr>
+              <w:t>0.25</w:t>
+            </w:r>
+          </w:p>
+        </w:tc>
+        <w:tc>
+          <w:tcPr>
+            <w:tcW w:type="dxa" w:w="1728"/>
+          </w:tcPr>
+          <w:p>
+            <w:pPr>
+              <w:spacing w:after="0" w:line="240" w:lineRule="auto"/>
+              <w:jc w:val="center"/>
+            </w:pPr>
+            <w:r/>
+            <w:r>
+              <w:rPr>
+                <w:sz w:val="18"/>
+              </w:rPr>
+              <w:t>0.012</w:t>
+            </w:r>
+          </w:p>
+        </w:tc>
+        <w:tc>
+          <w:tcPr>
+            <w:tcW w:type="dxa" w:w="1296"/>
+          </w:tcPr>
+          <w:p>
+            <w:pPr>
+              <w:spacing w:after="0" w:line="240" w:lineRule="auto"/>
+              <w:jc w:val="center"/>
+            </w:pPr>
+            <w:r/>
+            <w:r>
+              <w:rPr>
+                <w:sz w:val="18"/>
+              </w:rPr>
+              <w:t>0.007</w:t>
+            </w:r>
+          </w:p>
+        </w:tc>
+        <w:tc>
+          <w:tcPr>
+            <w:tcW w:type="dxa" w:w="2304"/>
+          </w:tcPr>
+          <w:p>
+            <w:pPr>
+              <w:spacing w:after="0" w:line="240" w:lineRule="auto"/>
+              <w:jc w:val="center"/>
+            </w:pPr>
+            <w:r/>
+            <w:r>
+              <w:rPr>
+                <w:sz w:val="18"/>
+              </w:rPr>
+              <w:t>[−0.007, 0.025]</w:t>
+            </w:r>
+          </w:p>
+        </w:tc>
+      </w:tr>
+      <w:tr>
+        <w:tc>
+          <w:tcPr>
+            <w:tcW w:type="dxa" w:w="2448"/>
+          </w:tcPr>
+          <w:p>
+            <w:pPr>
+              <w:spacing w:after="0" w:line="240" w:lineRule="auto"/>
+            </w:pPr>
+            <w:r/>
+            <w:r>
+              <w:rPr>
+                <w:sz w:val="18"/>
+              </w:rPr>
+              <w:t>Book leverage</w:t>
+            </w:r>
+          </w:p>
+        </w:tc>
+        <w:tc>
+          <w:tcPr>
+            <w:tcW w:type="dxa" w:w="864"/>
+          </w:tcPr>
+          <w:p>
+            <w:pPr>
+              <w:spacing w:after="0" w:line="240" w:lineRule="auto"/>
+              <w:jc w:val="center"/>
+            </w:pPr>
+            <w:r/>
+            <w:r>
+              <w:rPr>
+                <w:sz w:val="18"/>
+              </w:rPr>
+              <w:t>0.50</w:t>
+            </w:r>
+          </w:p>
+        </w:tc>
+        <w:tc>
+          <w:tcPr>
+            <w:tcW w:type="dxa" w:w="1728"/>
+          </w:tcPr>
+          <w:p>
+            <w:pPr>
+              <w:spacing w:after="0" w:line="240" w:lineRule="auto"/>
+              <w:jc w:val="center"/>
+            </w:pPr>
+            <w:r/>
+            <w:r>
+              <w:rPr>
+                <w:sz w:val="18"/>
+              </w:rPr>
+              <w:t>0.012</w:t>
+            </w:r>
+          </w:p>
+        </w:tc>
+        <w:tc>
+          <w:tcPr>
+            <w:tcW w:type="dxa" w:w="1296"/>
+          </w:tcPr>
+          <w:p>
+            <w:pPr>
+              <w:spacing w:after="0" w:line="240" w:lineRule="auto"/>
+              <w:jc w:val="center"/>
+            </w:pPr>
+            <w:r/>
+            <w:r>
+              <w:rPr>
+                <w:sz w:val="18"/>
+              </w:rPr>
+              <w:t>0.013</w:t>
+            </w:r>
+          </w:p>
+        </w:tc>
+        <w:tc>
+          <w:tcPr>
+            <w:tcW w:type="dxa" w:w="2304"/>
+          </w:tcPr>
+          <w:p>
+            <w:pPr>
+              <w:spacing w:after="0" w:line="240" w:lineRule="auto"/>
+              <w:jc w:val="center"/>
+            </w:pPr>
+            <w:r/>
+            <w:r>
+              <w:rPr>
+                <w:sz w:val="18"/>
+              </w:rPr>
+              <w:t>[−0.014, 0.031]</w:t>
+            </w:r>
+          </w:p>
+        </w:tc>
+      </w:tr>
+      <w:tr>
+        <w:tc>
+          <w:tcPr>
+            <w:tcW w:type="dxa" w:w="2448"/>
+          </w:tcPr>
+          <w:p>
+            <w:pPr>
+              <w:spacing w:after="0" w:line="240" w:lineRule="auto"/>
+            </w:pPr>
+            <w:r/>
+            <w:r>
+              <w:rPr>
+                <w:sz w:val="18"/>
+              </w:rPr>
+              <w:t>Book leverage</w:t>
+            </w:r>
+          </w:p>
+        </w:tc>
+        <w:tc>
+          <w:tcPr>
+            <w:tcW w:type="dxa" w:w="864"/>
+          </w:tcPr>
+          <w:p>
+            <w:pPr>
+              <w:spacing w:after="0" w:line="240" w:lineRule="auto"/>
+              <w:jc w:val="center"/>
+            </w:pPr>
+            <w:r/>
+            <w:r>
+              <w:rPr>
+                <w:sz w:val="18"/>
+              </w:rPr>
+              <w:t>1.00</w:t>
+            </w:r>
+          </w:p>
+        </w:tc>
+        <w:tc>
+          <w:tcPr>
+            <w:tcW w:type="dxa" w:w="1728"/>
+          </w:tcPr>
+          <w:p>
+            <w:pPr>
+              <w:spacing w:after="0" w:line="240" w:lineRule="auto"/>
+              <w:jc w:val="center"/>
+            </w:pPr>
+            <w:r/>
+            <w:r>
+              <w:rPr>
+                <w:sz w:val="18"/>
+              </w:rPr>
+              <w:t>0.012</w:t>
+            </w:r>
+          </w:p>
+        </w:tc>
+        <w:tc>
+          <w:tcPr>
+            <w:tcW w:type="dxa" w:w="1296"/>
+          </w:tcPr>
+          <w:p>
+            <w:pPr>
+              <w:spacing w:after="0" w:line="240" w:lineRule="auto"/>
+              <w:jc w:val="center"/>
+            </w:pPr>
+            <w:r/>
+            <w:r>
+              <w:rPr>
+                <w:sz w:val="18"/>
+              </w:rPr>
+              <w:t>0.026</w:t>
+            </w:r>
+          </w:p>
+        </w:tc>
+        <w:tc>
+          <w:tcPr>
+            <w:tcW w:type="dxa" w:w="2304"/>
+          </w:tcPr>
+          <w:p>
+            <w:pPr>
+              <w:spacing w:after="0" w:line="240" w:lineRule="auto"/>
+              <w:jc w:val="center"/>
+            </w:pPr>
+            <w:r/>
+            <w:r>
+              <w:rPr>
+                <w:sz w:val="18"/>
+              </w:rPr>
+              <w:t>[−0.027, 0.044]</w:t>
+            </w:r>
+          </w:p>
+        </w:tc>
+      </w:tr>
+      <w:tr>
+        <w:tc>
+          <w:tcPr>
+            <w:tcW w:type="dxa" w:w="2448"/>
+          </w:tcPr>
+          <w:p>
+            <w:pPr>
+              <w:spacing w:after="0" w:line="240" w:lineRule="auto"/>
+            </w:pPr>
+            <w:r/>
+            <w:r>
+              <w:rPr>
+                <w:sz w:val="18"/>
+              </w:rPr>
+              <w:t>ln(total assets)</w:t>
+            </w:r>
+          </w:p>
+        </w:tc>
+        <w:tc>
+          <w:tcPr>
+            <w:tcW w:type="dxa" w:w="864"/>
+          </w:tcPr>
+          <w:p>
+            <w:pPr>
+              <w:spacing w:after="0" w:line="240" w:lineRule="auto"/>
+              <w:jc w:val="center"/>
+            </w:pPr>
+            <w:r/>
+            <w:r>
+              <w:rPr>
+                <w:sz w:val="18"/>
+              </w:rPr>
+              <w:t>0.00</w:t>
+            </w:r>
+          </w:p>
+        </w:tc>
+        <w:tc>
+          <w:tcPr>
+            <w:tcW w:type="dxa" w:w="1728"/>
+          </w:tcPr>
+          <w:p>
+            <w:pPr>
+              <w:spacing w:after="0" w:line="240" w:lineRule="auto"/>
+              <w:jc w:val="center"/>
+            </w:pPr>
+            <w:r/>
+            <w:r>
+              <w:rPr>
+                <w:sz w:val="18"/>
+              </w:rPr>
+              <w:t>0.035</w:t>
+            </w:r>
+          </w:p>
+        </w:tc>
+        <w:tc>
+          <w:tcPr>
+            <w:tcW w:type="dxa" w:w="1296"/>
+          </w:tcPr>
+          <w:p>
+            <w:pPr>
+              <w:spacing w:after="0" w:line="240" w:lineRule="auto"/>
+              <w:jc w:val="center"/>
+            </w:pPr>
+            <w:r/>
+            <w:r>
+              <w:rPr>
+                <w:sz w:val="18"/>
+              </w:rPr>
+              <w:t>0.000</w:t>
+            </w:r>
+          </w:p>
+        </w:tc>
+        <w:tc>
+          <w:tcPr>
+            <w:tcW w:type="dxa" w:w="2304"/>
+          </w:tcPr>
+          <w:p>
+            <w:pPr>
+              <w:spacing w:after="0" w:line="240" w:lineRule="auto"/>
+              <w:jc w:val="center"/>
+            </w:pPr>
+            <w:r/>
+            <w:r>
+              <w:rPr>
+                <w:sz w:val="18"/>
+              </w:rPr>
+              <w:t>[0.007, 0.081]</w:t>
+            </w:r>
+          </w:p>
+        </w:tc>
+      </w:tr>
+      <w:tr>
+        <w:tc>
+          <w:tcPr>
+            <w:tcW w:type="dxa" w:w="2448"/>
+          </w:tcPr>
+          <w:p>
+            <w:pPr>
+              <w:spacing w:after="0" w:line="240" w:lineRule="auto"/>
+            </w:pPr>
+            <w:r/>
+            <w:r>
+              <w:rPr>
+                <w:sz w:val="18"/>
+              </w:rPr>
+              <w:t>ln(total assets)</w:t>
+            </w:r>
+          </w:p>
+        </w:tc>
+        <w:tc>
+          <w:tcPr>
+            <w:tcW w:type="dxa" w:w="864"/>
+          </w:tcPr>
+          <w:p>
+            <w:pPr>
+              <w:spacing w:after="0" w:line="240" w:lineRule="auto"/>
+              <w:jc w:val="center"/>
+            </w:pPr>
+            <w:r/>
+            <w:r>
+              <w:rPr>
+                <w:sz w:val="18"/>
+              </w:rPr>
+              <w:t>0.25</w:t>
+            </w:r>
+          </w:p>
+        </w:tc>
+        <w:tc>
+          <w:tcPr>
+            <w:tcW w:type="dxa" w:w="1728"/>
+          </w:tcPr>
+          <w:p>
+            <w:pPr>
+              <w:spacing w:after="0" w:line="240" w:lineRule="auto"/>
+              <w:jc w:val="center"/>
+            </w:pPr>
+            <w:r/>
+            <w:r>
+              <w:rPr>
+                <w:sz w:val="18"/>
+              </w:rPr>
+              <w:t>0.035</w:t>
+            </w:r>
+          </w:p>
+        </w:tc>
+        <w:tc>
+          <w:tcPr>
+            <w:tcW w:type="dxa" w:w="1296"/>
+          </w:tcPr>
+          <w:p>
+            <w:pPr>
+              <w:spacing w:after="0" w:line="240" w:lineRule="auto"/>
+              <w:jc w:val="center"/>
+            </w:pPr>
+            <w:r/>
+            <w:r>
+              <w:rPr>
+                <w:sz w:val="18"/>
+              </w:rPr>
+              <w:t>0.020</w:t>
+            </w:r>
+          </w:p>
+        </w:tc>
+        <w:tc>
+          <w:tcPr>
+            <w:tcW w:type="dxa" w:w="2304"/>
+          </w:tcPr>
+          <w:p>
+            <w:pPr>
+              <w:spacing w:after="0" w:line="240" w:lineRule="auto"/>
+              <w:jc w:val="center"/>
+            </w:pPr>
+            <w:r/>
+            <w:r>
+              <w:rPr>
+                <w:sz w:val="18"/>
+              </w:rPr>
+              <w:t>[−0.012, 0.101]</w:t>
+            </w:r>
+          </w:p>
+        </w:tc>
+      </w:tr>
+      <w:tr>
+        <w:tc>
+          <w:tcPr>
+            <w:tcW w:type="dxa" w:w="2448"/>
+          </w:tcPr>
+          <w:p>
+            <w:pPr>
+              <w:spacing w:after="0" w:line="240" w:lineRule="auto"/>
+            </w:pPr>
+            <w:r/>
+            <w:r>
+              <w:rPr>
+                <w:sz w:val="18"/>
+              </w:rPr>
+              <w:t>ln(total assets)</w:t>
+            </w:r>
+          </w:p>
+        </w:tc>
+        <w:tc>
+          <w:tcPr>
+            <w:tcW w:type="dxa" w:w="864"/>
+          </w:tcPr>
+          <w:p>
+            <w:pPr>
+              <w:spacing w:after="0" w:line="240" w:lineRule="auto"/>
+              <w:jc w:val="center"/>
+            </w:pPr>
+            <w:r/>
+            <w:r>
+              <w:rPr>
+                <w:sz w:val="18"/>
+              </w:rPr>
+              <w:t>0.50</w:t>
+            </w:r>
+          </w:p>
+        </w:tc>
+        <w:tc>
+          <w:tcPr>
+            <w:tcW w:type="dxa" w:w="1728"/>
+          </w:tcPr>
+          <w:p>
+            <w:pPr>
+              <w:spacing w:after="0" w:line="240" w:lineRule="auto"/>
+              <w:jc w:val="center"/>
+            </w:pPr>
+            <w:r/>
+            <w:r>
+              <w:rPr>
+                <w:sz w:val="18"/>
+              </w:rPr>
+              <w:t>0.035</w:t>
+            </w:r>
+          </w:p>
+        </w:tc>
+        <w:tc>
+          <w:tcPr>
+            <w:tcW w:type="dxa" w:w="1296"/>
+          </w:tcPr>
+          <w:p>
+            <w:pPr>
+              <w:spacing w:after="0" w:line="240" w:lineRule="auto"/>
+              <w:jc w:val="center"/>
+            </w:pPr>
+            <w:r/>
+            <w:r>
+              <w:rPr>
+                <w:sz w:val="18"/>
+              </w:rPr>
+              <w:t>0.039</w:t>
+            </w:r>
+          </w:p>
+        </w:tc>
+        <w:tc>
+          <w:tcPr>
+            <w:tcW w:type="dxa" w:w="2304"/>
+          </w:tcPr>
+          <w:p>
+            <w:pPr>
+              <w:spacing w:after="0" w:line="240" w:lineRule="auto"/>
+              <w:jc w:val="center"/>
+            </w:pPr>
+            <w:r/>
+            <w:r>
+              <w:rPr>
+                <w:sz w:val="18"/>
+              </w:rPr>
+              <w:t>[−0.032, 0.120]</w:t>
+            </w:r>
+          </w:p>
+        </w:tc>
+      </w:tr>
+      <w:tr>
+        <w:tc>
+          <w:tcPr>
+            <w:tcW w:type="dxa" w:w="2448"/>
+            <w:tcBorders>
+              <w:bottom w:val="single" w:sz="6" w:color="000000"/>
+            </w:tcBorders>
+          </w:tcPr>
+          <w:p>
+            <w:pPr>
+              <w:spacing w:after="0" w:line="240" w:lineRule="auto"/>
+            </w:pPr>
+            <w:r/>
+            <w:r>
+              <w:rPr>
+                <w:sz w:val="18"/>
+              </w:rPr>
+              <w:t>ln(total assets)</w:t>
+            </w:r>
+          </w:p>
+        </w:tc>
+        <w:tc>
+          <w:tcPr>
+            <w:tcW w:type="dxa" w:w="864"/>
+            <w:tcBorders>
+              <w:bottom w:val="single" w:sz="6" w:color="000000"/>
+            </w:tcBorders>
+          </w:tcPr>
+          <w:p>
+            <w:pPr>
+              <w:spacing w:after="0" w:line="240" w:lineRule="auto"/>
+              <w:jc w:val="center"/>
+            </w:pPr>
+            <w:r/>
+            <w:r>
+              <w:rPr>
+                <w:sz w:val="18"/>
+              </w:rPr>
+              <w:t>1.00</w:t>
+            </w:r>
+          </w:p>
+        </w:tc>
+        <w:tc>
+          <w:tcPr>
+            <w:tcW w:type="dxa" w:w="1728"/>
+            <w:tcBorders>
+              <w:bottom w:val="single" w:sz="6" w:color="000000"/>
+            </w:tcBorders>
+          </w:tcPr>
+          <w:p>
+            <w:pPr>
+              <w:spacing w:after="0" w:line="240" w:lineRule="auto"/>
+              <w:jc w:val="center"/>
+            </w:pPr>
+            <w:r/>
+            <w:r>
+              <w:rPr>
+                <w:sz w:val="18"/>
+              </w:rPr>
+              <w:t>0.035</w:t>
+            </w:r>
+          </w:p>
+        </w:tc>
+        <w:tc>
+          <w:tcPr>
+            <w:tcW w:type="dxa" w:w="1296"/>
+            <w:tcBorders>
+              <w:bottom w:val="single" w:sz="6" w:color="000000"/>
+            </w:tcBorders>
+          </w:tcPr>
+          <w:p>
+            <w:pPr>
+              <w:spacing w:after="0" w:line="240" w:lineRule="auto"/>
+              <w:jc w:val="center"/>
+            </w:pPr>
+            <w:r/>
+            <w:r>
+              <w:rPr>
+                <w:sz w:val="18"/>
+              </w:rPr>
+              <w:t>0.078</w:t>
+            </w:r>
+          </w:p>
+        </w:tc>
+        <w:tc>
+          <w:tcPr>
+            <w:tcW w:type="dxa" w:w="2304"/>
+            <w:tcBorders>
+              <w:bottom w:val="single" w:sz="6" w:color="000000"/>
+            </w:tcBorders>
+          </w:tcPr>
+          <w:p>
+            <w:pPr>
+              <w:spacing w:after="0" w:line="240" w:lineRule="auto"/>
+              <w:jc w:val="center"/>
+            </w:pPr>
+            <w:r/>
+            <w:r>
+              <w:rPr>
+                <w:sz w:val="18"/>
+              </w:rPr>
+              <w:t>[−0.071, 0.159]</w:t>
+            </w:r>
+          </w:p>
+        </w:tc>
+      </w:tr>
+    </w:tbl>
+    <w:p>
+      <w:pPr>
+        <w:spacing w:line="240" w:lineRule="auto" w:after="40" w:before="0"/>
+      </w:pPr>
+      <w:r>
+        <w:rPr>
+          <w:sz w:val="20"/>
+        </w:rPr>
+        <w:t>The bias bound equals M̄ times the largest change between consecutive pre-coverage event-time estimates times the weighted average of (e + 1) over event years 0 to 3, as in Eq. (10) of the paper; the robust interval widens the bootstrap 95% interval by this bound.</w:t>
+      </w:r>
+    </w:p>
+    <w:p>
+      <w:pPr>
+        <w:spacing w:line="240" w:lineRule="auto" w:after="40" w:before="0"/>
+      </w:pPr>
+      <w:r>
+        <w:rPr>
+          <w:sz w:val="20"/>
+        </w:rPr>
+        <w:t>Source: Authors' calculations from LSEG ESG scores and Compustat Global.</w:t>
+      </w:r>
+    </w:p>
+    <w:p>
+      <w:r>
+        <w:br w:type="page"/>
+      </w:r>
+    </w:p>
     <w:sectPr>
       <w:footerReference w:type="default" r:id="rId9"/>
       <w:pgSz w:w="12240" w:h="15840"/>

</xml_diff>

<commit_message>
Apply Springer figures/tables and structure checklist: Fig. n mentions, Methods heading, units in notes, table cell spacing, IA3 Market column
Co-Authored-By: Claude Opus 5.5 <noreply@anthropic.com>
Claude-Session: https://claude.ai/code/session_01Ka6Duc4zGYgPZcHc3gHgFv
</commit_message>
<xml_diff>
--- a/manuscript/Internet_Appendix.docx
+++ b/manuscript/Internet_Appendix.docx
@@ -33,7 +33,7 @@
       </w:pPr>
       <w:r>
         <w:rPr/>
-        <w:t>This Internet Appendix accompanies "Rated at the Peak? Firm Valuation around the First LSEG ESG Score in Five Southeast Asian Markets." Table IA1 re-estimates the average effects of the first score over event years 0 to 3 after excluding one market at a time. Table IA2 and Figure IA1 show the number of non-financial firms that received their first LSEG ESG score in each year, by market. Table IA3 reports the estimates for each market separately, Table IA4 the number of firm-years available for each outcome, and Table IA5 the relative-magnitude bounds of Eq. (10) in the paper. The pre-analysis plan is provided with the replication package.</w:t>
+        <w:t>This Internet Appendix accompanies "Rated at the Peak? Firm Valuation around the First LSEG ESG Score in Five Southeast Asian Markets." Table IA1 re-estimates the average effects of the first score over event years 0 to 3 after excluding one market at a time. Table IA2 and Fig. IA1 show the number of non-financial firms that received their first LSEG ESG score in each year, by market. Table IA3 reports the estimates for each market separately, Table IA4 the number of firm-years available for each outcome, and Table IA5 the relative-magnitude bounds of Eq. (10) in the paper. The pre-analysis plan is provided with the replication package.</w:t>
       </w:r>
     </w:p>
     <w:p>
@@ -65,19 +65,25 @@
         <w:jc w:val="center"/>
         <w:tblLayout w:type="fixed"/>
         <w:tblLook w:firstColumn="1" w:firstRow="1" w:lastColumn="0" w:lastRow="0" w:noHBand="0" w:noVBand="1" w:val="04A0"/>
+        <w:tblCellMar>
+          <w:top w:w="40" w:type="dxa"/>
+          <w:bottom w:w="40" w:type="dxa"/>
+          <w:left w:w="85" w:type="dxa"/>
+          <w:right w:w="85" w:type="dxa"/>
+        </w:tblCellMar>
         <w:tblLayout w:type="fixed"/>
       </w:tblPr>
       <w:tblGrid>
-        <w:gridCol w:w="3311"/>
-        <w:gridCol w:w="1512"/>
-        <w:gridCol w:w="1512"/>
-        <w:gridCol w:w="1512"/>
-        <w:gridCol w:w="1512"/>
+        <w:gridCol w:w="2736"/>
+        <w:gridCol w:w="1655"/>
+        <w:gridCol w:w="1655"/>
+        <w:gridCol w:w="1655"/>
+        <w:gridCol w:w="1655"/>
       </w:tblGrid>
       <w:tr>
         <w:tc>
           <w:tcPr>
-            <w:tcW w:type="dxa" w:w="3312"/>
+            <w:tcW w:type="dxa" w:w="2736"/>
             <w:tcBorders>
               <w:top w:val="single" w:sz="6" w:color="000000"/>
               <w:bottom w:val="single" w:sz="6" w:color="000000"/>
@@ -99,7 +105,7 @@
         </w:tc>
         <w:tc>
           <w:tcPr>
-            <w:tcW w:type="dxa" w:w="1512"/>
+            <w:tcW w:type="dxa" w:w="1656"/>
             <w:tcBorders>
               <w:top w:val="single" w:sz="6" w:color="000000"/>
               <w:bottom w:val="single" w:sz="6" w:color="000000"/>
@@ -122,7 +128,7 @@
         </w:tc>
         <w:tc>
           <w:tcPr>
-            <w:tcW w:type="dxa" w:w="1512"/>
+            <w:tcW w:type="dxa" w:w="1656"/>
             <w:tcBorders>
               <w:top w:val="single" w:sz="6" w:color="000000"/>
               <w:bottom w:val="single" w:sz="6" w:color="000000"/>
@@ -145,7 +151,7 @@
         </w:tc>
         <w:tc>
           <w:tcPr>
-            <w:tcW w:type="dxa" w:w="1512"/>
+            <w:tcW w:type="dxa" w:w="1656"/>
             <w:tcBorders>
               <w:top w:val="single" w:sz="6" w:color="000000"/>
               <w:bottom w:val="single" w:sz="6" w:color="000000"/>
@@ -168,7 +174,7 @@
         </w:tc>
         <w:tc>
           <w:tcPr>
-            <w:tcW w:type="dxa" w:w="1512"/>
+            <w:tcW w:type="dxa" w:w="1656"/>
             <w:tcBorders>
               <w:top w:val="single" w:sz="6" w:color="000000"/>
               <w:bottom w:val="single" w:sz="6" w:color="000000"/>
@@ -193,7 +199,7 @@
       <w:tr>
         <w:tc>
           <w:tcPr>
-            <w:tcW w:type="dxa" w:w="3312"/>
+            <w:tcW w:type="dxa" w:w="2736"/>
           </w:tcPr>
           <w:p>
             <w:pPr>
@@ -210,7 +216,7 @@
         </w:tc>
         <w:tc>
           <w:tcPr>
-            <w:tcW w:type="dxa" w:w="1512"/>
+            <w:tcW w:type="dxa" w:w="1656"/>
           </w:tcPr>
           <w:p>
             <w:pPr>
@@ -228,7 +234,7 @@
         </w:tc>
         <w:tc>
           <w:tcPr>
-            <w:tcW w:type="dxa" w:w="1512"/>
+            <w:tcW w:type="dxa" w:w="1656"/>
           </w:tcPr>
           <w:p>
             <w:pPr>
@@ -246,7 +252,7 @@
         </w:tc>
         <w:tc>
           <w:tcPr>
-            <w:tcW w:type="dxa" w:w="1512"/>
+            <w:tcW w:type="dxa" w:w="1656"/>
           </w:tcPr>
           <w:p>
             <w:pPr>
@@ -264,7 +270,7 @@
         </w:tc>
         <w:tc>
           <w:tcPr>
-            <w:tcW w:type="dxa" w:w="1512"/>
+            <w:tcW w:type="dxa" w:w="1656"/>
           </w:tcPr>
           <w:p>
             <w:pPr>
@@ -284,7 +290,7 @@
       <w:tr>
         <w:tc>
           <w:tcPr>
-            <w:tcW w:type="dxa" w:w="3312"/>
+            <w:tcW w:type="dxa" w:w="2736"/>
           </w:tcPr>
           <w:p>
             <w:pPr>
@@ -301,7 +307,7 @@
         </w:tc>
         <w:tc>
           <w:tcPr>
-            <w:tcW w:type="dxa" w:w="1512"/>
+            <w:tcW w:type="dxa" w:w="1656"/>
           </w:tcPr>
           <w:p>
             <w:pPr>
@@ -319,7 +325,7 @@
         </w:tc>
         <w:tc>
           <w:tcPr>
-            <w:tcW w:type="dxa" w:w="1512"/>
+            <w:tcW w:type="dxa" w:w="1656"/>
           </w:tcPr>
           <w:p>
             <w:pPr>
@@ -337,7 +343,7 @@
         </w:tc>
         <w:tc>
           <w:tcPr>
-            <w:tcW w:type="dxa" w:w="1512"/>
+            <w:tcW w:type="dxa" w:w="1656"/>
           </w:tcPr>
           <w:p>
             <w:pPr>
@@ -355,7 +361,7 @@
         </w:tc>
         <w:tc>
           <w:tcPr>
-            <w:tcW w:type="dxa" w:w="1512"/>
+            <w:tcW w:type="dxa" w:w="1656"/>
           </w:tcPr>
           <w:p>
             <w:pPr>
@@ -375,7 +381,7 @@
       <w:tr>
         <w:tc>
           <w:tcPr>
-            <w:tcW w:type="dxa" w:w="3312"/>
+            <w:tcW w:type="dxa" w:w="2736"/>
           </w:tcPr>
           <w:p>
             <w:pPr>
@@ -392,7 +398,7 @@
         </w:tc>
         <w:tc>
           <w:tcPr>
-            <w:tcW w:type="dxa" w:w="1512"/>
+            <w:tcW w:type="dxa" w:w="1656"/>
           </w:tcPr>
           <w:p>
             <w:pPr>
@@ -410,7 +416,7 @@
         </w:tc>
         <w:tc>
           <w:tcPr>
-            <w:tcW w:type="dxa" w:w="1512"/>
+            <w:tcW w:type="dxa" w:w="1656"/>
           </w:tcPr>
           <w:p>
             <w:pPr>
@@ -428,7 +434,7 @@
         </w:tc>
         <w:tc>
           <w:tcPr>
-            <w:tcW w:type="dxa" w:w="1512"/>
+            <w:tcW w:type="dxa" w:w="1656"/>
           </w:tcPr>
           <w:p>
             <w:pPr>
@@ -446,7 +452,7 @@
         </w:tc>
         <w:tc>
           <w:tcPr>
-            <w:tcW w:type="dxa" w:w="1512"/>
+            <w:tcW w:type="dxa" w:w="1656"/>
           </w:tcPr>
           <w:p>
             <w:pPr>
@@ -466,7 +472,7 @@
       <w:tr>
         <w:tc>
           <w:tcPr>
-            <w:tcW w:type="dxa" w:w="3312"/>
+            <w:tcW w:type="dxa" w:w="2736"/>
           </w:tcPr>
           <w:p>
             <w:pPr>
@@ -483,7 +489,7 @@
         </w:tc>
         <w:tc>
           <w:tcPr>
-            <w:tcW w:type="dxa" w:w="1512"/>
+            <w:tcW w:type="dxa" w:w="1656"/>
           </w:tcPr>
           <w:p>
             <w:pPr>
@@ -501,7 +507,7 @@
         </w:tc>
         <w:tc>
           <w:tcPr>
-            <w:tcW w:type="dxa" w:w="1512"/>
+            <w:tcW w:type="dxa" w:w="1656"/>
           </w:tcPr>
           <w:p>
             <w:pPr>
@@ -519,7 +525,7 @@
         </w:tc>
         <w:tc>
           <w:tcPr>
-            <w:tcW w:type="dxa" w:w="1512"/>
+            <w:tcW w:type="dxa" w:w="1656"/>
           </w:tcPr>
           <w:p>
             <w:pPr>
@@ -537,7 +543,7 @@
         </w:tc>
         <w:tc>
           <w:tcPr>
-            <w:tcW w:type="dxa" w:w="1512"/>
+            <w:tcW w:type="dxa" w:w="1656"/>
           </w:tcPr>
           <w:p>
             <w:pPr>
@@ -557,7 +563,7 @@
       <w:tr>
         <w:tc>
           <w:tcPr>
-            <w:tcW w:type="dxa" w:w="3312"/>
+            <w:tcW w:type="dxa" w:w="2736"/>
             <w:tcBorders>
               <w:bottom w:val="single" w:sz="6" w:color="000000"/>
             </w:tcBorders>
@@ -577,7 +583,7 @@
         </w:tc>
         <w:tc>
           <w:tcPr>
-            <w:tcW w:type="dxa" w:w="1512"/>
+            <w:tcW w:type="dxa" w:w="1656"/>
             <w:tcBorders>
               <w:bottom w:val="single" w:sz="6" w:color="000000"/>
             </w:tcBorders>
@@ -598,7 +604,7 @@
         </w:tc>
         <w:tc>
           <w:tcPr>
-            <w:tcW w:type="dxa" w:w="1512"/>
+            <w:tcW w:type="dxa" w:w="1656"/>
             <w:tcBorders>
               <w:bottom w:val="single" w:sz="6" w:color="000000"/>
             </w:tcBorders>
@@ -619,7 +625,7 @@
         </w:tc>
         <w:tc>
           <w:tcPr>
-            <w:tcW w:type="dxa" w:w="1512"/>
+            <w:tcW w:type="dxa" w:w="1656"/>
             <w:tcBorders>
               <w:bottom w:val="single" w:sz="6" w:color="000000"/>
             </w:tcBorders>
@@ -640,7 +646,7 @@
         </w:tc>
         <w:tc>
           <w:tcPr>
-            <w:tcW w:type="dxa" w:w="1512"/>
+            <w:tcW w:type="dxa" w:w="1656"/>
             <w:tcBorders>
               <w:bottom w:val="single" w:sz="6" w:color="000000"/>
             </w:tcBorders>
@@ -712,6 +718,12 @@
         <w:jc w:val="center"/>
         <w:tblLayout w:type="fixed"/>
         <w:tblLook w:firstColumn="1" w:firstRow="1" w:lastColumn="0" w:lastRow="0" w:noHBand="0" w:noVBand="1" w:val="04A0"/>
+        <w:tblCellMar>
+          <w:top w:w="40" w:type="dxa"/>
+          <w:bottom w:w="40" w:type="dxa"/>
+          <w:left w:w="85" w:type="dxa"/>
+          <w:right w:w="85" w:type="dxa"/>
+        </w:tblCellMar>
         <w:tblLayout w:type="fixed"/>
       </w:tblPr>
       <w:tblGrid>
@@ -2312,20 +2324,26 @@
         <w:jc w:val="center"/>
         <w:tblLayout w:type="fixed"/>
         <w:tblLook w:firstColumn="1" w:firstRow="1" w:lastColumn="0" w:lastRow="0" w:noHBand="0" w:noVBand="1" w:val="04A0"/>
+        <w:tblCellMar>
+          <w:top w:w="40" w:type="dxa"/>
+          <w:bottom w:w="40" w:type="dxa"/>
+          <w:left w:w="85" w:type="dxa"/>
+          <w:right w:w="85" w:type="dxa"/>
+        </w:tblCellMar>
         <w:tblLayout w:type="fixed"/>
       </w:tblPr>
       <w:tblGrid>
-        <w:gridCol w:w="1872"/>
-        <w:gridCol w:w="1440"/>
-        <w:gridCol w:w="1440"/>
-        <w:gridCol w:w="1440"/>
-        <w:gridCol w:w="1440"/>
+        <w:gridCol w:w="1728"/>
+        <w:gridCol w:w="1584"/>
+        <w:gridCol w:w="1584"/>
+        <w:gridCol w:w="1584"/>
+        <w:gridCol w:w="1584"/>
         <w:gridCol w:w="1296"/>
       </w:tblGrid>
       <w:tr>
         <w:tc>
           <w:tcPr>
-            <w:tcW w:type="dxa" w:w="1872"/>
+            <w:tcW w:type="dxa" w:w="1728"/>
             <w:tcBorders>
               <w:top w:val="single" w:sz="6" w:color="000000"/>
               <w:bottom w:val="single" w:sz="6" w:color="000000"/>
@@ -2347,7 +2365,7 @@
         </w:tc>
         <w:tc>
           <w:tcPr>
-            <w:tcW w:type="dxa" w:w="1440"/>
+            <w:tcW w:type="dxa" w:w="1584"/>
             <w:tcBorders>
               <w:top w:val="single" w:sz="6" w:color="000000"/>
               <w:bottom w:val="single" w:sz="6" w:color="000000"/>
@@ -2370,7 +2388,7 @@
         </w:tc>
         <w:tc>
           <w:tcPr>
-            <w:tcW w:type="dxa" w:w="1440"/>
+            <w:tcW w:type="dxa" w:w="1584"/>
             <w:tcBorders>
               <w:top w:val="single" w:sz="6" w:color="000000"/>
               <w:bottom w:val="single" w:sz="6" w:color="000000"/>
@@ -2393,7 +2411,7 @@
         </w:tc>
         <w:tc>
           <w:tcPr>
-            <w:tcW w:type="dxa" w:w="1440"/>
+            <w:tcW w:type="dxa" w:w="1584"/>
             <w:tcBorders>
               <w:top w:val="single" w:sz="6" w:color="000000"/>
               <w:bottom w:val="single" w:sz="6" w:color="000000"/>
@@ -2416,7 +2434,7 @@
         </w:tc>
         <w:tc>
           <w:tcPr>
-            <w:tcW w:type="dxa" w:w="1440"/>
+            <w:tcW w:type="dxa" w:w="1584"/>
             <w:tcBorders>
               <w:top w:val="single" w:sz="6" w:color="000000"/>
               <w:bottom w:val="single" w:sz="6" w:color="000000"/>
@@ -2464,7 +2482,7 @@
       <w:tr>
         <w:tc>
           <w:tcPr>
-            <w:tcW w:type="dxa" w:w="1872"/>
+            <w:tcW w:type="dxa" w:w="1728"/>
           </w:tcPr>
           <w:p>
             <w:pPr>
@@ -2481,7 +2499,7 @@
         </w:tc>
         <w:tc>
           <w:tcPr>
-            <w:tcW w:type="dxa" w:w="1440"/>
+            <w:tcW w:type="dxa" w:w="1584"/>
           </w:tcPr>
           <w:p>
             <w:pPr>
@@ -2499,7 +2517,7 @@
         </w:tc>
         <w:tc>
           <w:tcPr>
-            <w:tcW w:type="dxa" w:w="1440"/>
+            <w:tcW w:type="dxa" w:w="1584"/>
           </w:tcPr>
           <w:p>
             <w:pPr>
@@ -2517,7 +2535,7 @@
         </w:tc>
         <w:tc>
           <w:tcPr>
-            <w:tcW w:type="dxa" w:w="1440"/>
+            <w:tcW w:type="dxa" w:w="1584"/>
           </w:tcPr>
           <w:p>
             <w:pPr>
@@ -2535,7 +2553,7 @@
         </w:tc>
         <w:tc>
           <w:tcPr>
-            <w:tcW w:type="dxa" w:w="1440"/>
+            <w:tcW w:type="dxa" w:w="1584"/>
           </w:tcPr>
           <w:p>
             <w:pPr>
@@ -2573,7 +2591,7 @@
       <w:tr>
         <w:tc>
           <w:tcPr>
-            <w:tcW w:type="dxa" w:w="1872"/>
+            <w:tcW w:type="dxa" w:w="1728"/>
           </w:tcPr>
           <w:p>
             <w:pPr>
@@ -2590,7 +2608,7 @@
         </w:tc>
         <w:tc>
           <w:tcPr>
-            <w:tcW w:type="dxa" w:w="1440"/>
+            <w:tcW w:type="dxa" w:w="1584"/>
           </w:tcPr>
           <w:p>
             <w:pPr>
@@ -2608,7 +2626,7 @@
         </w:tc>
         <w:tc>
           <w:tcPr>
-            <w:tcW w:type="dxa" w:w="1440"/>
+            <w:tcW w:type="dxa" w:w="1584"/>
           </w:tcPr>
           <w:p>
             <w:pPr>
@@ -2626,7 +2644,7 @@
         </w:tc>
         <w:tc>
           <w:tcPr>
-            <w:tcW w:type="dxa" w:w="1440"/>
+            <w:tcW w:type="dxa" w:w="1584"/>
           </w:tcPr>
           <w:p>
             <w:pPr>
@@ -2644,7 +2662,7 @@
         </w:tc>
         <w:tc>
           <w:tcPr>
-            <w:tcW w:type="dxa" w:w="1440"/>
+            <w:tcW w:type="dxa" w:w="1584"/>
           </w:tcPr>
           <w:p>
             <w:pPr>
@@ -2682,7 +2700,7 @@
       <w:tr>
         <w:tc>
           <w:tcPr>
-            <w:tcW w:type="dxa" w:w="1872"/>
+            <w:tcW w:type="dxa" w:w="1728"/>
           </w:tcPr>
           <w:p>
             <w:pPr>
@@ -2699,7 +2717,7 @@
         </w:tc>
         <w:tc>
           <w:tcPr>
-            <w:tcW w:type="dxa" w:w="1440"/>
+            <w:tcW w:type="dxa" w:w="1584"/>
           </w:tcPr>
           <w:p>
             <w:pPr>
@@ -2717,7 +2735,7 @@
         </w:tc>
         <w:tc>
           <w:tcPr>
-            <w:tcW w:type="dxa" w:w="1440"/>
+            <w:tcW w:type="dxa" w:w="1584"/>
           </w:tcPr>
           <w:p>
             <w:pPr>
@@ -2735,7 +2753,7 @@
         </w:tc>
         <w:tc>
           <w:tcPr>
-            <w:tcW w:type="dxa" w:w="1440"/>
+            <w:tcW w:type="dxa" w:w="1584"/>
           </w:tcPr>
           <w:p>
             <w:pPr>
@@ -2753,7 +2771,7 @@
         </w:tc>
         <w:tc>
           <w:tcPr>
-            <w:tcW w:type="dxa" w:w="1440"/>
+            <w:tcW w:type="dxa" w:w="1584"/>
           </w:tcPr>
           <w:p>
             <w:pPr>
@@ -2791,7 +2809,7 @@
       <w:tr>
         <w:tc>
           <w:tcPr>
-            <w:tcW w:type="dxa" w:w="1872"/>
+            <w:tcW w:type="dxa" w:w="1728"/>
           </w:tcPr>
           <w:p>
             <w:pPr>
@@ -2808,7 +2826,7 @@
         </w:tc>
         <w:tc>
           <w:tcPr>
-            <w:tcW w:type="dxa" w:w="1440"/>
+            <w:tcW w:type="dxa" w:w="1584"/>
           </w:tcPr>
           <w:p>
             <w:pPr>
@@ -2826,7 +2844,7 @@
         </w:tc>
         <w:tc>
           <w:tcPr>
-            <w:tcW w:type="dxa" w:w="1440"/>
+            <w:tcW w:type="dxa" w:w="1584"/>
           </w:tcPr>
           <w:p>
             <w:pPr>
@@ -2844,7 +2862,7 @@
         </w:tc>
         <w:tc>
           <w:tcPr>
-            <w:tcW w:type="dxa" w:w="1440"/>
+            <w:tcW w:type="dxa" w:w="1584"/>
           </w:tcPr>
           <w:p>
             <w:pPr>
@@ -2862,7 +2880,7 @@
         </w:tc>
         <w:tc>
           <w:tcPr>
-            <w:tcW w:type="dxa" w:w="1440"/>
+            <w:tcW w:type="dxa" w:w="1584"/>
           </w:tcPr>
           <w:p>
             <w:pPr>
@@ -2900,7 +2918,7 @@
       <w:tr>
         <w:tc>
           <w:tcPr>
-            <w:tcW w:type="dxa" w:w="1872"/>
+            <w:tcW w:type="dxa" w:w="1728"/>
             <w:tcBorders>
               <w:bottom w:val="single" w:sz="6" w:color="000000"/>
             </w:tcBorders>
@@ -2920,7 +2938,7 @@
         </w:tc>
         <w:tc>
           <w:tcPr>
-            <w:tcW w:type="dxa" w:w="1440"/>
+            <w:tcW w:type="dxa" w:w="1584"/>
             <w:tcBorders>
               <w:bottom w:val="single" w:sz="6" w:color="000000"/>
             </w:tcBorders>
@@ -2941,7 +2959,7 @@
         </w:tc>
         <w:tc>
           <w:tcPr>
-            <w:tcW w:type="dxa" w:w="1440"/>
+            <w:tcW w:type="dxa" w:w="1584"/>
             <w:tcBorders>
               <w:bottom w:val="single" w:sz="6" w:color="000000"/>
             </w:tcBorders>
@@ -2962,7 +2980,7 @@
         </w:tc>
         <w:tc>
           <w:tcPr>
-            <w:tcW w:type="dxa" w:w="1440"/>
+            <w:tcW w:type="dxa" w:w="1584"/>
             <w:tcBorders>
               <w:bottom w:val="single" w:sz="6" w:color="000000"/>
             </w:tcBorders>
@@ -2983,7 +3001,7 @@
         </w:tc>
         <w:tc>
           <w:tcPr>
-            <w:tcW w:type="dxa" w:w="1440"/>
+            <w:tcW w:type="dxa" w:w="1584"/>
             <w:tcBorders>
               <w:bottom w:val="single" w:sz="6" w:color="000000"/>
             </w:tcBorders>
@@ -3076,6 +3094,12 @@
         <w:jc w:val="center"/>
         <w:tblLayout w:type="fixed"/>
         <w:tblLook w:firstColumn="1" w:firstRow="1" w:lastColumn="0" w:lastRow="0" w:noHBand="0" w:noVBand="1" w:val="04A0"/>
+        <w:tblCellMar>
+          <w:top w:w="40" w:type="dxa"/>
+          <w:bottom w:w="40" w:type="dxa"/>
+          <w:left w:w="85" w:type="dxa"/>
+          <w:right w:w="85" w:type="dxa"/>
+        </w:tblCellMar>
         <w:tblLayout w:type="fixed"/>
       </w:tblPr>
       <w:tblGrid>
@@ -3731,6 +3755,12 @@
         <w:jc w:val="center"/>
         <w:tblLayout w:type="fixed"/>
         <w:tblLook w:firstColumn="1" w:firstRow="1" w:lastColumn="0" w:lastRow="0" w:noHBand="0" w:noVBand="1" w:val="04A0"/>
+        <w:tblCellMar>
+          <w:top w:w="40" w:type="dxa"/>
+          <w:bottom w:w="40" w:type="dxa"/>
+          <w:left w:w="85" w:type="dxa"/>
+          <w:right w:w="85" w:type="dxa"/>
+        </w:tblCellMar>
         <w:tblLayout w:type="fixed"/>
       </w:tblPr>
       <w:tblGrid>

</xml_diff>

<commit_message>
Stage 4' complete: v3 manuscript with round-3 R outputs (Table IA6), trimmed to 9,990 words; checks 97/97
Co-Authored-By: Claude Opus 5.5 <noreply@anthropic.com>
Claude-Session: https://claude.ai/code/session_01Ka6Duc4zGYgPZcHc3gHgFv
</commit_message>
<xml_diff>
--- a/manuscript/Internet_Appendix.docx
+++ b/manuscript/Internet_Appendix.docx
@@ -33,7 +33,7 @@
       </w:pPr>
       <w:r>
         <w:rPr/>
-        <w:t>This Internet Appendix accompanies "Rated at the Peak? Firm Valuation around the First LSEG ESG Score in Five Southeast Asian Markets." Table IA1 re-estimates the average effects of the first score over event years 0 to 3 after excluding one market at a time. Table IA2 and Fig. IA1 show the number of non-financial firms that received their first LSEG ESG score in each year, by market. Table IA3 reports the estimates for each market separately, Table IA4 the number of firm-years available for each outcome, and Table IA5 the relative-magnitude bounds of Eq. (10) in the paper. The pre-analysis plan is provided with the replication package.</w:t>
+        <w:t>This Internet Appendix accompanies "Rated at the Peak? Firm Valuation around the First LSEG ESG Score in Five Southeast Asian Markets." Table IA1 re-estimates the average effects of the first score over event years 0 to 3 after excluding one market at a time. Table IA2 and Fig. IA1 show the number of non-financial firms that received their first LSEG ESG score in each year, by market. Table IA3 reports the estimates for each market separately, Table IA4 the number of firm-years available for each outcome, Table IA5 the relative-magnitude bounds of Eq. (10) in the paper, and Table IA6 the number of scored and control firms by event year for ln MTB. The pre-analysis plan is provided with the replication package.</w:t>
       </w:r>
     </w:p>
     <w:p>
@@ -675,7 +675,7 @@
         <w:rPr>
           <w:sz w:val="20"/>
         </w:rPr>
-        <w:t>Each cell reports the average effect over event years 0 to 3 with the bootstrap standard error in parentheses, estimated as in the baseline after dropping all firms from the named market; *, **, and *** denote significance at the 10%, 5%, and 1% levels based on unadjusted p-values.</w:t>
+        <w:t>Each cell reports the average effect over event years 0 to 3 with the bootstrap standard error in parentheses, estimated as in the baseline after dropping all firms from the named market; *, **, and *** denote significance at the 10%, 5%, and 1% levels based on unadjusted p-values. Log outcomes are in log points and book leverage is a ratio.</w:t>
       </w:r>
     </w:p>
     <w:p>
@@ -2359,7 +2359,7 @@
                 <w:b/>
                 <w:sz w:val="18"/>
               </w:rPr>
-              <w:t>Specification</w:t>
+              <w:t>Market</w:t>
             </w:r>
           </w:p>
         </w:tc>
@@ -3051,7 +3051,7 @@
         <w:rPr>
           <w:sz w:val="20"/>
         </w:rPr>
-        <w:t>Each cell reports the average effect over event years 0 to 3 with the bootstrap standard error in parentheses, estimated with scored and never-scored firms from the named market only; *, **, and *** denote significance at the 10%, 5%, and 1% levels based on unadjusted p-values.</w:t>
+        <w:t>Each cell reports the average effect over event years 0 to 3 with the bootstrap standard error in parentheses, estimated with scored and never-scored firms from the named market only; *, **, and *** denote significance at the 10%, 5%, and 1% levels based on unadjusted p-values. Log outcomes are in log points and book leverage is a ratio.</w:t>
       </w:r>
     </w:p>
     <w:p>
@@ -5366,7 +5366,848 @@
         <w:rPr>
           <w:sz w:val="20"/>
         </w:rPr>
-        <w:t>The bias bound equals M̄ times the largest change between consecutive pre-coverage event-time estimates times the weighted average of (e + 1) over event years 0 to 3, as in Eq. (10) of the paper; the robust interval widens the bootstrap 95% interval by this bound.</w:t>
+        <w:t>The bias bound equals M̄ times the largest change between consecutive pre-coverage event-time estimates times the weighted average of (e + 1) over event years 0 to 3, as in Eq. (10) of the paper; the robust interval widens the bootstrap 95% interval by this bound. Log outcomes are in log points and book leverage is a ratio.</w:t>
+      </w:r>
+    </w:p>
+    <w:p>
+      <w:pPr>
+        <w:spacing w:line="240" w:lineRule="auto" w:after="40" w:before="0"/>
+      </w:pPr>
+      <w:r>
+        <w:rPr>
+          <w:sz w:val="20"/>
+        </w:rPr>
+        <w:t>Source: Authors' calculations from LSEG ESG scores and Compustat Global.</w:t>
+      </w:r>
+    </w:p>
+    <w:p>
+      <w:r>
+        <w:br w:type="page"/>
+      </w:r>
+    </w:p>
+    <w:p>
+      <w:pPr>
+        <w:spacing w:line="240" w:lineRule="auto" w:after="120" w:before="0"/>
+      </w:pPr>
+      <w:r>
+        <w:rPr>
+          <w:b/>
+        </w:rPr>
+        <w:t>Table IA6</w:t>
+      </w:r>
+      <w:r>
+        <w:t xml:space="preserve"> </w:t>
+      </w:r>
+      <w:r>
+        <w:rPr/>
+        <w:t>Scored firms and control firms by event year for ln(MTB)</w:t>
+      </w:r>
+    </w:p>
+    <w:tbl>
+      <w:tblPr>
+        <w:tblW w:type="auto" w:w="0"/>
+        <w:jc w:val="center"/>
+        <w:tblLayout w:type="fixed"/>
+        <w:tblLook w:firstColumn="1" w:firstRow="1" w:lastColumn="0" w:lastRow="0" w:noHBand="0" w:noVBand="1" w:val="04A0"/>
+        <w:tblCellMar>
+          <w:top w:w="40" w:type="dxa"/>
+          <w:bottom w:w="40" w:type="dxa"/>
+          <w:left w:w="85" w:type="dxa"/>
+          <w:right w:w="85" w:type="dxa"/>
+        </w:tblCellMar>
+        <w:tblLayout w:type="fixed"/>
+      </w:tblPr>
+      <w:tblGrid>
+        <w:gridCol w:w="1728"/>
+        <w:gridCol w:w="1872"/>
+        <w:gridCol w:w="1584"/>
+        <w:gridCol w:w="3168"/>
+      </w:tblGrid>
+      <w:tr>
+        <w:tc>
+          <w:tcPr>
+            <w:tcW w:type="dxa" w:w="1728"/>
+            <w:tcBorders>
+              <w:top w:val="single" w:sz="6" w:color="000000"/>
+              <w:bottom w:val="single" w:sz="6" w:color="000000"/>
+            </w:tcBorders>
+          </w:tcPr>
+          <w:p>
+            <w:pPr>
+              <w:spacing w:after="0" w:line="240" w:lineRule="auto"/>
+            </w:pPr>
+            <w:r/>
+            <w:r>
+              <w:rPr>
+                <w:b/>
+                <w:sz w:val="18"/>
+              </w:rPr>
+              <w:t>Event year</w:t>
+            </w:r>
+          </w:p>
+        </w:tc>
+        <w:tc>
+          <w:tcPr>
+            <w:tcW w:type="dxa" w:w="1872"/>
+            <w:tcBorders>
+              <w:top w:val="single" w:sz="6" w:color="000000"/>
+              <w:bottom w:val="single" w:sz="6" w:color="000000"/>
+            </w:tcBorders>
+          </w:tcPr>
+          <w:p>
+            <w:pPr>
+              <w:spacing w:after="0" w:line="240" w:lineRule="auto"/>
+              <w:jc w:val="center"/>
+            </w:pPr>
+            <w:r/>
+            <w:r>
+              <w:rPr>
+                <w:b/>
+                <w:sz w:val="18"/>
+              </w:rPr>
+              <w:t>Scored firms</w:t>
+            </w:r>
+          </w:p>
+        </w:tc>
+        <w:tc>
+          <w:tcPr>
+            <w:tcW w:type="dxa" w:w="1584"/>
+            <w:tcBorders>
+              <w:top w:val="single" w:sz="6" w:color="000000"/>
+              <w:bottom w:val="single" w:sz="6" w:color="000000"/>
+            </w:tcBorders>
+          </w:tcPr>
+          <w:p>
+            <w:pPr>
+              <w:spacing w:after="0" w:line="240" w:lineRule="auto"/>
+              <w:jc w:val="center"/>
+            </w:pPr>
+            <w:r/>
+            <w:r>
+              <w:rPr>
+                <w:b/>
+                <w:sz w:val="18"/>
+              </w:rPr>
+              <w:t>Cohorts</w:t>
+            </w:r>
+          </w:p>
+        </w:tc>
+        <w:tc>
+          <w:tcPr>
+            <w:tcW w:type="dxa" w:w="3168"/>
+            <w:tcBorders>
+              <w:top w:val="single" w:sz="6" w:color="000000"/>
+              <w:bottom w:val="single" w:sz="6" w:color="000000"/>
+            </w:tcBorders>
+          </w:tcPr>
+          <w:p>
+            <w:pPr>
+              <w:spacing w:after="0" w:line="240" w:lineRule="auto"/>
+              <w:jc w:val="center"/>
+            </w:pPr>
+            <w:r/>
+            <w:r>
+              <w:rPr>
+                <w:b/>
+                <w:sz w:val="18"/>
+              </w:rPr>
+              <w:t>Control firms per cohort cell</w:t>
+            </w:r>
+          </w:p>
+        </w:tc>
+      </w:tr>
+      <w:tr>
+        <w:tc>
+          <w:tcPr>
+            <w:tcW w:type="dxa" w:w="1728"/>
+          </w:tcPr>
+          <w:p>
+            <w:pPr>
+              <w:spacing w:after="0" w:line="240" w:lineRule="auto"/>
+            </w:pPr>
+            <w:r/>
+            <w:r>
+              <w:rPr>
+                <w:sz w:val="18"/>
+              </w:rPr>
+              <w:t>−5</w:t>
+            </w:r>
+          </w:p>
+        </w:tc>
+        <w:tc>
+          <w:tcPr>
+            <w:tcW w:type="dxa" w:w="1872"/>
+          </w:tcPr>
+          <w:p>
+            <w:pPr>
+              <w:spacing w:after="0" w:line="240" w:lineRule="auto"/>
+              <w:jc w:val="center"/>
+            </w:pPr>
+            <w:r/>
+            <w:r>
+              <w:rPr>
+                <w:sz w:val="18"/>
+              </w:rPr>
+              <w:t>497</w:t>
+            </w:r>
+          </w:p>
+        </w:tc>
+        <w:tc>
+          <w:tcPr>
+            <w:tcW w:type="dxa" w:w="1584"/>
+          </w:tcPr>
+          <w:p>
+            <w:pPr>
+              <w:spacing w:after="0" w:line="240" w:lineRule="auto"/>
+              <w:jc w:val="center"/>
+            </w:pPr>
+            <w:r/>
+            <w:r>
+              <w:rPr>
+                <w:sz w:val="18"/>
+              </w:rPr>
+              <w:t>6</w:t>
+            </w:r>
+          </w:p>
+        </w:tc>
+        <w:tc>
+          <w:tcPr>
+            <w:tcW w:type="dxa" w:w="3168"/>
+          </w:tcPr>
+          <w:p>
+            <w:pPr>
+              <w:spacing w:after="0" w:line="240" w:lineRule="auto"/>
+              <w:jc w:val="center"/>
+            </w:pPr>
+            <w:r/>
+            <w:r>
+              <w:rPr>
+                <w:sz w:val="18"/>
+              </w:rPr>
+              <w:t>1,420–1,732</w:t>
+            </w:r>
+          </w:p>
+        </w:tc>
+      </w:tr>
+      <w:tr>
+        <w:tc>
+          <w:tcPr>
+            <w:tcW w:type="dxa" w:w="1728"/>
+          </w:tcPr>
+          <w:p>
+            <w:pPr>
+              <w:spacing w:after="0" w:line="240" w:lineRule="auto"/>
+            </w:pPr>
+            <w:r/>
+            <w:r>
+              <w:rPr>
+                <w:sz w:val="18"/>
+              </w:rPr>
+              <w:t>−4</w:t>
+            </w:r>
+          </w:p>
+        </w:tc>
+        <w:tc>
+          <w:tcPr>
+            <w:tcW w:type="dxa" w:w="1872"/>
+          </w:tcPr>
+          <w:p>
+            <w:pPr>
+              <w:spacing w:after="0" w:line="240" w:lineRule="auto"/>
+              <w:jc w:val="center"/>
+            </w:pPr>
+            <w:r/>
+            <w:r>
+              <w:rPr>
+                <w:sz w:val="18"/>
+              </w:rPr>
+              <w:t>521</w:t>
+            </w:r>
+          </w:p>
+        </w:tc>
+        <w:tc>
+          <w:tcPr>
+            <w:tcW w:type="dxa" w:w="1584"/>
+          </w:tcPr>
+          <w:p>
+            <w:pPr>
+              <w:spacing w:after="0" w:line="240" w:lineRule="auto"/>
+              <w:jc w:val="center"/>
+            </w:pPr>
+            <w:r/>
+            <w:r>
+              <w:rPr>
+                <w:sz w:val="18"/>
+              </w:rPr>
+              <w:t>7</w:t>
+            </w:r>
+          </w:p>
+        </w:tc>
+        <w:tc>
+          <w:tcPr>
+            <w:tcW w:type="dxa" w:w="3168"/>
+          </w:tcPr>
+          <w:p>
+            <w:pPr>
+              <w:spacing w:after="0" w:line="240" w:lineRule="auto"/>
+              <w:jc w:val="center"/>
+            </w:pPr>
+            <w:r/>
+            <w:r>
+              <w:rPr>
+                <w:sz w:val="18"/>
+              </w:rPr>
+              <w:t>1,431–1,800</w:t>
+            </w:r>
+          </w:p>
+        </w:tc>
+      </w:tr>
+      <w:tr>
+        <w:tc>
+          <w:tcPr>
+            <w:tcW w:type="dxa" w:w="1728"/>
+          </w:tcPr>
+          <w:p>
+            <w:pPr>
+              <w:spacing w:after="0" w:line="240" w:lineRule="auto"/>
+            </w:pPr>
+            <w:r/>
+            <w:r>
+              <w:rPr>
+                <w:sz w:val="18"/>
+              </w:rPr>
+              <w:t>−3</w:t>
+            </w:r>
+          </w:p>
+        </w:tc>
+        <w:tc>
+          <w:tcPr>
+            <w:tcW w:type="dxa" w:w="1872"/>
+          </w:tcPr>
+          <w:p>
+            <w:pPr>
+              <w:spacing w:after="0" w:line="240" w:lineRule="auto"/>
+              <w:jc w:val="center"/>
+            </w:pPr>
+            <w:r/>
+            <w:r>
+              <w:rPr>
+                <w:sz w:val="18"/>
+              </w:rPr>
+              <w:t>549</w:t>
+            </w:r>
+          </w:p>
+        </w:tc>
+        <w:tc>
+          <w:tcPr>
+            <w:tcW w:type="dxa" w:w="1584"/>
+          </w:tcPr>
+          <w:p>
+            <w:pPr>
+              <w:spacing w:after="0" w:line="240" w:lineRule="auto"/>
+              <w:jc w:val="center"/>
+            </w:pPr>
+            <w:r/>
+            <w:r>
+              <w:rPr>
+                <w:sz w:val="18"/>
+              </w:rPr>
+              <w:t>8</w:t>
+            </w:r>
+          </w:p>
+        </w:tc>
+        <w:tc>
+          <w:tcPr>
+            <w:tcW w:type="dxa" w:w="3168"/>
+          </w:tcPr>
+          <w:p>
+            <w:pPr>
+              <w:spacing w:after="0" w:line="240" w:lineRule="auto"/>
+              <w:jc w:val="center"/>
+            </w:pPr>
+            <w:r/>
+            <w:r>
+              <w:rPr>
+                <w:sz w:val="18"/>
+              </w:rPr>
+              <w:t>1,444–1,899</w:t>
+            </w:r>
+          </w:p>
+        </w:tc>
+      </w:tr>
+      <w:tr>
+        <w:tc>
+          <w:tcPr>
+            <w:tcW w:type="dxa" w:w="1728"/>
+          </w:tcPr>
+          <w:p>
+            <w:pPr>
+              <w:spacing w:after="0" w:line="240" w:lineRule="auto"/>
+            </w:pPr>
+            <w:r/>
+            <w:r>
+              <w:rPr>
+                <w:sz w:val="18"/>
+              </w:rPr>
+              <w:t>−2</w:t>
+            </w:r>
+          </w:p>
+        </w:tc>
+        <w:tc>
+          <w:tcPr>
+            <w:tcW w:type="dxa" w:w="1872"/>
+          </w:tcPr>
+          <w:p>
+            <w:pPr>
+              <w:spacing w:after="0" w:line="240" w:lineRule="auto"/>
+              <w:jc w:val="center"/>
+            </w:pPr>
+            <w:r/>
+            <w:r>
+              <w:rPr>
+                <w:sz w:val="18"/>
+              </w:rPr>
+              <w:t>581</w:t>
+            </w:r>
+          </w:p>
+        </w:tc>
+        <w:tc>
+          <w:tcPr>
+            <w:tcW w:type="dxa" w:w="1584"/>
+          </w:tcPr>
+          <w:p>
+            <w:pPr>
+              <w:spacing w:after="0" w:line="240" w:lineRule="auto"/>
+              <w:jc w:val="center"/>
+            </w:pPr>
+            <w:r/>
+            <w:r>
+              <w:rPr>
+                <w:sz w:val="18"/>
+              </w:rPr>
+              <w:t>9</w:t>
+            </w:r>
+          </w:p>
+        </w:tc>
+        <w:tc>
+          <w:tcPr>
+            <w:tcW w:type="dxa" w:w="3168"/>
+          </w:tcPr>
+          <w:p>
+            <w:pPr>
+              <w:spacing w:after="0" w:line="240" w:lineRule="auto"/>
+              <w:jc w:val="center"/>
+            </w:pPr>
+            <w:r/>
+            <w:r>
+              <w:rPr>
+                <w:sz w:val="18"/>
+              </w:rPr>
+              <w:t>1,455–2,065</w:t>
+            </w:r>
+          </w:p>
+        </w:tc>
+      </w:tr>
+      <w:tr>
+        <w:tc>
+          <w:tcPr>
+            <w:tcW w:type="dxa" w:w="1728"/>
+          </w:tcPr>
+          <w:p>
+            <w:pPr>
+              <w:spacing w:after="0" w:line="240" w:lineRule="auto"/>
+            </w:pPr>
+            <w:r/>
+            <w:r>
+              <w:rPr>
+                <w:sz w:val="18"/>
+              </w:rPr>
+              <w:t>0</w:t>
+            </w:r>
+          </w:p>
+        </w:tc>
+        <w:tc>
+          <w:tcPr>
+            <w:tcW w:type="dxa" w:w="1872"/>
+          </w:tcPr>
+          <w:p>
+            <w:pPr>
+              <w:spacing w:after="0" w:line="240" w:lineRule="auto"/>
+              <w:jc w:val="center"/>
+            </w:pPr>
+            <w:r/>
+            <w:r>
+              <w:rPr>
+                <w:sz w:val="18"/>
+              </w:rPr>
+              <w:t>615</w:t>
+            </w:r>
+          </w:p>
+        </w:tc>
+        <w:tc>
+          <w:tcPr>
+            <w:tcW w:type="dxa" w:w="1584"/>
+          </w:tcPr>
+          <w:p>
+            <w:pPr>
+              <w:spacing w:after="0" w:line="240" w:lineRule="auto"/>
+              <w:jc w:val="center"/>
+            </w:pPr>
+            <w:r/>
+            <w:r>
+              <w:rPr>
+                <w:sz w:val="18"/>
+              </w:rPr>
+              <w:t>10</w:t>
+            </w:r>
+          </w:p>
+        </w:tc>
+        <w:tc>
+          <w:tcPr>
+            <w:tcW w:type="dxa" w:w="3168"/>
+          </w:tcPr>
+          <w:p>
+            <w:pPr>
+              <w:spacing w:after="0" w:line="240" w:lineRule="auto"/>
+              <w:jc w:val="center"/>
+            </w:pPr>
+            <w:r/>
+            <w:r>
+              <w:rPr>
+                <w:sz w:val="18"/>
+              </w:rPr>
+              <w:t>1,453–2,189</w:t>
+            </w:r>
+          </w:p>
+        </w:tc>
+      </w:tr>
+      <w:tr>
+        <w:tc>
+          <w:tcPr>
+            <w:tcW w:type="dxa" w:w="1728"/>
+          </w:tcPr>
+          <w:p>
+            <w:pPr>
+              <w:spacing w:after="0" w:line="240" w:lineRule="auto"/>
+            </w:pPr>
+            <w:r/>
+            <w:r>
+              <w:rPr>
+                <w:sz w:val="18"/>
+              </w:rPr>
+              <w:t>1</w:t>
+            </w:r>
+          </w:p>
+        </w:tc>
+        <w:tc>
+          <w:tcPr>
+            <w:tcW w:type="dxa" w:w="1872"/>
+          </w:tcPr>
+          <w:p>
+            <w:pPr>
+              <w:spacing w:after="0" w:line="240" w:lineRule="auto"/>
+              <w:jc w:val="center"/>
+            </w:pPr>
+            <w:r/>
+            <w:r>
+              <w:rPr>
+                <w:sz w:val="18"/>
+              </w:rPr>
+              <w:t>578</w:t>
+            </w:r>
+          </w:p>
+        </w:tc>
+        <w:tc>
+          <w:tcPr>
+            <w:tcW w:type="dxa" w:w="1584"/>
+          </w:tcPr>
+          <w:p>
+            <w:pPr>
+              <w:spacing w:after="0" w:line="240" w:lineRule="auto"/>
+              <w:jc w:val="center"/>
+            </w:pPr>
+            <w:r/>
+            <w:r>
+              <w:rPr>
+                <w:sz w:val="18"/>
+              </w:rPr>
+              <w:t>9</w:t>
+            </w:r>
+          </w:p>
+        </w:tc>
+        <w:tc>
+          <w:tcPr>
+            <w:tcW w:type="dxa" w:w="3168"/>
+          </w:tcPr>
+          <w:p>
+            <w:pPr>
+              <w:spacing w:after="0" w:line="240" w:lineRule="auto"/>
+              <w:jc w:val="center"/>
+            </w:pPr>
+            <w:r/>
+            <w:r>
+              <w:rPr>
+                <w:sz w:val="18"/>
+              </w:rPr>
+              <w:t>1,442–2,034</w:t>
+            </w:r>
+          </w:p>
+        </w:tc>
+      </w:tr>
+      <w:tr>
+        <w:tc>
+          <w:tcPr>
+            <w:tcW w:type="dxa" w:w="1728"/>
+          </w:tcPr>
+          <w:p>
+            <w:pPr>
+              <w:spacing w:after="0" w:line="240" w:lineRule="auto"/>
+            </w:pPr>
+            <w:r/>
+            <w:r>
+              <w:rPr>
+                <w:sz w:val="18"/>
+              </w:rPr>
+              <w:t>2</w:t>
+            </w:r>
+          </w:p>
+        </w:tc>
+        <w:tc>
+          <w:tcPr>
+            <w:tcW w:type="dxa" w:w="1872"/>
+          </w:tcPr>
+          <w:p>
+            <w:pPr>
+              <w:spacing w:after="0" w:line="240" w:lineRule="auto"/>
+              <w:jc w:val="center"/>
+            </w:pPr>
+            <w:r/>
+            <w:r>
+              <w:rPr>
+                <w:sz w:val="18"/>
+              </w:rPr>
+              <w:t>483</w:t>
+            </w:r>
+          </w:p>
+        </w:tc>
+        <w:tc>
+          <w:tcPr>
+            <w:tcW w:type="dxa" w:w="1584"/>
+          </w:tcPr>
+          <w:p>
+            <w:pPr>
+              <w:spacing w:after="0" w:line="240" w:lineRule="auto"/>
+              <w:jc w:val="center"/>
+            </w:pPr>
+            <w:r/>
+            <w:r>
+              <w:rPr>
+                <w:sz w:val="18"/>
+              </w:rPr>
+              <w:t>8</w:t>
+            </w:r>
+          </w:p>
+        </w:tc>
+        <w:tc>
+          <w:tcPr>
+            <w:tcW w:type="dxa" w:w="3168"/>
+          </w:tcPr>
+          <w:p>
+            <w:pPr>
+              <w:spacing w:after="0" w:line="240" w:lineRule="auto"/>
+              <w:jc w:val="center"/>
+            </w:pPr>
+            <w:r/>
+            <w:r>
+              <w:rPr>
+                <w:sz w:val="18"/>
+              </w:rPr>
+              <w:t>1,430–1,895</w:t>
+            </w:r>
+          </w:p>
+        </w:tc>
+      </w:tr>
+      <w:tr>
+        <w:tc>
+          <w:tcPr>
+            <w:tcW w:type="dxa" w:w="1728"/>
+          </w:tcPr>
+          <w:p>
+            <w:pPr>
+              <w:spacing w:after="0" w:line="240" w:lineRule="auto"/>
+            </w:pPr>
+            <w:r/>
+            <w:r>
+              <w:rPr>
+                <w:sz w:val="18"/>
+              </w:rPr>
+              <w:t>3</w:t>
+            </w:r>
+          </w:p>
+        </w:tc>
+        <w:tc>
+          <w:tcPr>
+            <w:tcW w:type="dxa" w:w="1872"/>
+          </w:tcPr>
+          <w:p>
+            <w:pPr>
+              <w:spacing w:after="0" w:line="240" w:lineRule="auto"/>
+              <w:jc w:val="center"/>
+            </w:pPr>
+            <w:r/>
+            <w:r>
+              <w:rPr>
+                <w:sz w:val="18"/>
+              </w:rPr>
+              <w:t>270</w:t>
+            </w:r>
+          </w:p>
+        </w:tc>
+        <w:tc>
+          <w:tcPr>
+            <w:tcW w:type="dxa" w:w="1584"/>
+          </w:tcPr>
+          <w:p>
+            <w:pPr>
+              <w:spacing w:after="0" w:line="240" w:lineRule="auto"/>
+              <w:jc w:val="center"/>
+            </w:pPr>
+            <w:r/>
+            <w:r>
+              <w:rPr>
+                <w:sz w:val="18"/>
+              </w:rPr>
+              <w:t>7</w:t>
+            </w:r>
+          </w:p>
+        </w:tc>
+        <w:tc>
+          <w:tcPr>
+            <w:tcW w:type="dxa" w:w="3168"/>
+          </w:tcPr>
+          <w:p>
+            <w:pPr>
+              <w:spacing w:after="0" w:line="240" w:lineRule="auto"/>
+              <w:jc w:val="center"/>
+            </w:pPr>
+            <w:r/>
+            <w:r>
+              <w:rPr>
+                <w:sz w:val="18"/>
+              </w:rPr>
+              <w:t>1,418–1,796</w:t>
+            </w:r>
+          </w:p>
+        </w:tc>
+      </w:tr>
+      <w:tr>
+        <w:tc>
+          <w:tcPr>
+            <w:tcW w:type="dxa" w:w="1728"/>
+            <w:tcBorders>
+              <w:bottom w:val="single" w:sz="6" w:color="000000"/>
+            </w:tcBorders>
+          </w:tcPr>
+          <w:p>
+            <w:pPr>
+              <w:spacing w:after="0" w:line="240" w:lineRule="auto"/>
+            </w:pPr>
+            <w:r/>
+            <w:r>
+              <w:rPr>
+                <w:sz w:val="18"/>
+              </w:rPr>
+              <w:t>4</w:t>
+            </w:r>
+          </w:p>
+        </w:tc>
+        <w:tc>
+          <w:tcPr>
+            <w:tcW w:type="dxa" w:w="1872"/>
+            <w:tcBorders>
+              <w:bottom w:val="single" w:sz="6" w:color="000000"/>
+            </w:tcBorders>
+          </w:tcPr>
+          <w:p>
+            <w:pPr>
+              <w:spacing w:after="0" w:line="240" w:lineRule="auto"/>
+              <w:jc w:val="center"/>
+            </w:pPr>
+            <w:r/>
+            <w:r>
+              <w:rPr>
+                <w:sz w:val="18"/>
+              </w:rPr>
+              <w:t>141</w:t>
+            </w:r>
+          </w:p>
+        </w:tc>
+        <w:tc>
+          <w:tcPr>
+            <w:tcW w:type="dxa" w:w="1584"/>
+            <w:tcBorders>
+              <w:bottom w:val="single" w:sz="6" w:color="000000"/>
+            </w:tcBorders>
+          </w:tcPr>
+          <w:p>
+            <w:pPr>
+              <w:spacing w:after="0" w:line="240" w:lineRule="auto"/>
+              <w:jc w:val="center"/>
+            </w:pPr>
+            <w:r/>
+            <w:r>
+              <w:rPr>
+                <w:sz w:val="18"/>
+              </w:rPr>
+              <w:t>6</w:t>
+            </w:r>
+          </w:p>
+        </w:tc>
+        <w:tc>
+          <w:tcPr>
+            <w:tcW w:type="dxa" w:w="3168"/>
+            <w:tcBorders>
+              <w:bottom w:val="single" w:sz="6" w:color="000000"/>
+            </w:tcBorders>
+          </w:tcPr>
+          <w:p>
+            <w:pPr>
+              <w:spacing w:after="0" w:line="240" w:lineRule="auto"/>
+              <w:jc w:val="center"/>
+            </w:pPr>
+            <w:r/>
+            <w:r>
+              <w:rPr>
+                <w:sz w:val="18"/>
+              </w:rPr>
+              <w:t>1,407–1,732</w:t>
+            </w:r>
+          </w:p>
+        </w:tc>
+      </w:tr>
+    </w:tbl>
+    <w:p>
+      <w:pPr>
+        <w:spacing w:line="240" w:lineRule="auto" w:after="40" w:before="0"/>
+      </w:pPr>
+      <w:r>
+        <w:rPr>
+          <w:sz w:val="20"/>
+        </w:rPr>
+        <w:t xml:space="preserve">Scored firms are summed over cohorts; control firms are the never-scored firms available in each cohort's comparison of year </w:t>
+      </w:r>
+      <w:r>
+        <w:rPr>
+          <w:i/>
+          <w:sz w:val="20"/>
+        </w:rPr>
+        <w:t>g</w:t>
+      </w:r>
+      <w:r>
+        <w:rPr>
+          <w:sz w:val="20"/>
+        </w:rPr>
+        <w:t xml:space="preserve"> − 1 with the given event year, shown as the smallest and largest count across cohorts.</w:t>
       </w:r>
     </w:p>
     <w:p>

</xml_diff>

<commit_message>
APA 7 references and in-text citations; table/figure notes cut to two sentences; shorter table labels (R); ledger D-21b to D-24
Co-Authored-By: Claude Opus 5.5 <noreply@anthropic.com>
Claude-Session: https://claude.ai/code/session_01Ka6Duc4zGYgPZcHc3gHgFv
</commit_message>
<xml_diff>
--- a/manuscript/Internet_Appendix.docx
+++ b/manuscript/Internet_Appendix.docx
@@ -99,7 +99,7 @@
                 <w:b/>
                 <w:sz w:val="18"/>
               </w:rPr>
-              <w:t>Specification</w:t>
+              <w:t>Sample</w:t>
             </w:r>
           </w:p>
         </w:tc>
@@ -145,7 +145,7 @@
                 <w:b/>
                 <w:sz w:val="18"/>
               </w:rPr>
-              <w:t>ln(market capitalization)</w:t>
+              <w:t>ln(market cap)</w:t>
             </w:r>
           </w:p>
         </w:tc>
@@ -168,7 +168,7 @@
                 <w:b/>
                 <w:sz w:val="18"/>
               </w:rPr>
-              <w:t>Book leverage</w:t>
+              <w:t>Leverage (ratio)</w:t>
             </w:r>
           </w:p>
         </w:tc>
@@ -191,7 +191,7 @@
                 <w:b/>
                 <w:sz w:val="18"/>
               </w:rPr>
-              <w:t>ln(total assets)</w:t>
+              <w:t>ln(assets)</w:t>
             </w:r>
           </w:p>
         </w:tc>
@@ -210,7 +210,7 @@
               <w:rPr>
                 <w:sz w:val="18"/>
               </w:rPr>
-              <w:t>Excluding Indonesia</w:t>
+              <w:t>Without Indonesia</w:t>
             </w:r>
           </w:p>
         </w:tc>
@@ -301,7 +301,7 @@
               <w:rPr>
                 <w:sz w:val="18"/>
               </w:rPr>
-              <w:t>Excluding Malaysia</w:t>
+              <w:t>Without Malaysia</w:t>
             </w:r>
           </w:p>
         </w:tc>
@@ -392,7 +392,7 @@
               <w:rPr>
                 <w:sz w:val="18"/>
               </w:rPr>
-              <w:t>Excluding Philippines</w:t>
+              <w:t>Without Philippines</w:t>
             </w:r>
           </w:p>
         </w:tc>
@@ -483,7 +483,7 @@
               <w:rPr>
                 <w:sz w:val="18"/>
               </w:rPr>
-              <w:t>Excluding Singapore</w:t>
+              <w:t>Without Singapore</w:t>
             </w:r>
           </w:p>
         </w:tc>
@@ -577,7 +577,7 @@
               <w:rPr>
                 <w:sz w:val="18"/>
               </w:rPr>
-              <w:t>Excluding Thailand</w:t>
+              <w:t>Without Thailand</w:t>
             </w:r>
           </w:p>
         </w:tc>
@@ -675,7 +675,20 @@
         <w:rPr>
           <w:sz w:val="20"/>
         </w:rPr>
-        <w:t>Each cell reports the average effect over event years 0 to 3 with the bootstrap standard error in parentheses, estimated as in the baseline after dropping all firms from the named market; *, **, and *** denote significance at the 10%, 5%, and 1% levels based on unadjusted p-values. Log outcomes are in log points and book leverage is a ratio.</w:t>
+        <w:t xml:space="preserve">Cells show the average effect over event years 0 to 3 without the named market, with bootstrap standard errors in parentheses. *, **, and *** denote significance at 10%, 5%, and 1% (unadjusted </w:t>
+      </w:r>
+      <w:r>
+        <w:rPr>
+          <w:i/>
+          <w:sz w:val="20"/>
+        </w:rPr>
+        <w:t>p</w:t>
+      </w:r>
+      <w:r>
+        <w:rPr>
+          <w:sz w:val="20"/>
+        </w:rPr>
+        <w:t>-values).</w:t>
       </w:r>
     </w:p>
     <w:p>
@@ -2197,7 +2210,7 @@
         <w:rPr>
           <w:sz w:val="20"/>
         </w:rPr>
-        <w:t>Counts cover firms in the estimation sample; firms first scored in 2014 are excluded because they have no pre-coverage year.</w:t>
+        <w:t>Firms first scored in 2014 are excluded because they have no pre-coverage year.</w:t>
       </w:r>
     </w:p>
     <w:p>
@@ -2281,7 +2294,7 @@
         <w:rPr>
           <w:sz w:val="20"/>
         </w:rPr>
-        <w:t>Bars show the number of firms in the estimation sample that received their first LSEG ESG score in each year, all five markets combined.</w:t>
+        <w:t>Bars show the number of firms in the estimation sample first scored in each year, all five markets combined.</w:t>
       </w:r>
     </w:p>
     <w:p>
@@ -2405,7 +2418,7 @@
                 <w:b/>
                 <w:sz w:val="18"/>
               </w:rPr>
-              <w:t>ln(market capitalization)</w:t>
+              <w:t>ln(market cap)</w:t>
             </w:r>
           </w:p>
         </w:tc>
@@ -2428,7 +2441,7 @@
                 <w:b/>
                 <w:sz w:val="18"/>
               </w:rPr>
-              <w:t>Book leverage</w:t>
+              <w:t>Leverage (ratio)</w:t>
             </w:r>
           </w:p>
         </w:tc>
@@ -2451,7 +2464,7 @@
                 <w:b/>
                 <w:sz w:val="18"/>
               </w:rPr>
-              <w:t>ln(total assets)</w:t>
+              <w:t>ln(assets)</w:t>
             </w:r>
           </w:p>
         </w:tc>
@@ -2474,7 +2487,7 @@
                 <w:b/>
                 <w:sz w:val="18"/>
               </w:rPr>
-              <w:t>Scored firms (ln MTB)</w:t>
+              <w:t>Scored firms</w:t>
             </w:r>
           </w:p>
         </w:tc>
@@ -3051,7 +3064,20 @@
         <w:rPr>
           <w:sz w:val="20"/>
         </w:rPr>
-        <w:t>Each cell reports the average effect over event years 0 to 3 with the bootstrap standard error in parentheses, estimated with scored and never-scored firms from the named market only; *, **, and *** denote significance at the 10%, 5%, and 1% levels based on unadjusted p-values. Log outcomes are in log points and book leverage is a ratio.</w:t>
+        <w:t xml:space="preserve">Cells show the average effect over event years 0 to 3 estimated within each market, with bootstrap standard errors in parentheses. *, **, and *** denote significance at 10%, 5%, and 1% (unadjusted </w:t>
+      </w:r>
+      <w:r>
+        <w:rPr>
+          <w:i/>
+          <w:sz w:val="20"/>
+        </w:rPr>
+        <w:t>p</w:t>
+      </w:r>
+      <w:r>
+        <w:rPr>
+          <w:sz w:val="20"/>
+        </w:rPr>
+        <w:t>-values).</w:t>
       </w:r>
     </w:p>
     <w:p>
@@ -3152,7 +3178,7 @@
                 <w:b/>
                 <w:sz w:val="18"/>
               </w:rPr>
-              <w:t>Scored firms: firm-years</w:t>
+              <w:t>Scored firm-years</w:t>
             </w:r>
           </w:p>
         </w:tc>
@@ -3175,7 +3201,7 @@
                 <w:b/>
                 <w:sz w:val="18"/>
               </w:rPr>
-              <w:t>Scored firms: firms</w:t>
+              <w:t>Scored firms</w:t>
             </w:r>
           </w:p>
         </w:tc>
@@ -3198,7 +3224,7 @@
                 <w:b/>
                 <w:sz w:val="18"/>
               </w:rPr>
-              <w:t>Never-scored: firm-years</w:t>
+              <w:t>Never-scored firm-years</w:t>
             </w:r>
           </w:p>
         </w:tc>
@@ -3221,7 +3247,7 @@
                 <w:b/>
                 <w:sz w:val="18"/>
               </w:rPr>
-              <w:t>Never-scored: firms</w:t>
+              <w:t>Never-scored firms</w:t>
             </w:r>
           </w:p>
         </w:tc>
@@ -3244,7 +3270,7 @@
                 <w:b/>
                 <w:sz w:val="18"/>
               </w:rPr>
-              <w:t>Share of firm-years missing</w:t>
+              <w:t>Share missing</w:t>
             </w:r>
           </w:p>
         </w:tc>
@@ -3372,7 +3398,7 @@
               <w:rPr>
                 <w:sz w:val="18"/>
               </w:rPr>
-              <w:t>ln(market capitalization)</w:t>
+              <w:t>ln(market cap)</w:t>
             </w:r>
           </w:p>
         </w:tc>
@@ -3481,7 +3507,7 @@
               <w:rPr>
                 <w:sz w:val="18"/>
               </w:rPr>
-              <w:t>Book leverage</w:t>
+              <w:t>Leverage (ratio)</w:t>
             </w:r>
           </w:p>
         </w:tc>
@@ -3593,7 +3619,7 @@
               <w:rPr>
                 <w:sz w:val="18"/>
               </w:rPr>
-              <w:t>ln(total assets)</w:t>
+              <w:t>ln(assets)</w:t>
             </w:r>
           </w:p>
         </w:tc>
@@ -3712,7 +3738,7 @@
         <w:rPr>
           <w:sz w:val="20"/>
         </w:rPr>
-        <w:t>Counts refer to the estimation sample after winsorization; the last column is the share of estimation firm-years with a missing value of the outcome.</w:t>
+        <w:t>Counts refer to the estimation sample; the last column is the share of firm-years with a missing outcome.</w:t>
       </w:r>
     </w:p>
     <w:p>
@@ -3835,7 +3861,7 @@
                 <w:b/>
                 <w:sz w:val="18"/>
               </w:rPr>
-              <w:t>Largest pre-period change</w:t>
+              <w:t>Max pre-period change</w:t>
             </w:r>
           </w:p>
         </w:tc>
@@ -4264,7 +4290,7 @@
               <w:rPr>
                 <w:sz w:val="18"/>
               </w:rPr>
-              <w:t>ln(market capitalization)</w:t>
+              <w:t>ln(market cap)</w:t>
             </w:r>
           </w:p>
         </w:tc>
@@ -4355,7 +4381,7 @@
               <w:rPr>
                 <w:sz w:val="18"/>
               </w:rPr>
-              <w:t>ln(market capitalization)</w:t>
+              <w:t>ln(market cap)</w:t>
             </w:r>
           </w:p>
         </w:tc>
@@ -4446,7 +4472,7 @@
               <w:rPr>
                 <w:sz w:val="18"/>
               </w:rPr>
-              <w:t>ln(market capitalization)</w:t>
+              <w:t>ln(market cap)</w:t>
             </w:r>
           </w:p>
         </w:tc>
@@ -4537,7 +4563,7 @@
               <w:rPr>
                 <w:sz w:val="18"/>
               </w:rPr>
-              <w:t>ln(market capitalization)</w:t>
+              <w:t>ln(market cap)</w:t>
             </w:r>
           </w:p>
         </w:tc>
@@ -4628,7 +4654,7 @@
               <w:rPr>
                 <w:sz w:val="18"/>
               </w:rPr>
-              <w:t>Book leverage</w:t>
+              <w:t>Leverage (ratio)</w:t>
             </w:r>
           </w:p>
         </w:tc>
@@ -4719,7 +4745,7 @@
               <w:rPr>
                 <w:sz w:val="18"/>
               </w:rPr>
-              <w:t>Book leverage</w:t>
+              <w:t>Leverage (ratio)</w:t>
             </w:r>
           </w:p>
         </w:tc>
@@ -4810,7 +4836,7 @@
               <w:rPr>
                 <w:sz w:val="18"/>
               </w:rPr>
-              <w:t>Book leverage</w:t>
+              <w:t>Leverage (ratio)</w:t>
             </w:r>
           </w:p>
         </w:tc>
@@ -4901,7 +4927,7 @@
               <w:rPr>
                 <w:sz w:val="18"/>
               </w:rPr>
-              <w:t>Book leverage</w:t>
+              <w:t>Leverage (ratio)</w:t>
             </w:r>
           </w:p>
         </w:tc>
@@ -4992,7 +5018,7 @@
               <w:rPr>
                 <w:sz w:val="18"/>
               </w:rPr>
-              <w:t>ln(total assets)</w:t>
+              <w:t>ln(assets)</w:t>
             </w:r>
           </w:p>
         </w:tc>
@@ -5083,7 +5109,7 @@
               <w:rPr>
                 <w:sz w:val="18"/>
               </w:rPr>
-              <w:t>ln(total assets)</w:t>
+              <w:t>ln(assets)</w:t>
             </w:r>
           </w:p>
         </w:tc>
@@ -5174,7 +5200,7 @@
               <w:rPr>
                 <w:sz w:val="18"/>
               </w:rPr>
-              <w:t>ln(total assets)</w:t>
+              <w:t>ln(assets)</w:t>
             </w:r>
           </w:p>
         </w:tc>
@@ -5268,7 +5294,7 @@
               <w:rPr>
                 <w:sz w:val="18"/>
               </w:rPr>
-              <w:t>ln(total assets)</w:t>
+              <w:t>ln(assets)</w:t>
             </w:r>
           </w:p>
         </w:tc>
@@ -5366,7 +5392,7 @@
         <w:rPr>
           <w:sz w:val="20"/>
         </w:rPr>
-        <w:t>The bias bound equals M̄ times the largest change between consecutive pre-coverage event-time estimates times the weighted average of (e + 1) over event years 0 to 3, as in Eq. (10) of the paper; the robust interval widens the bootstrap 95% interval by this bound. Log outcomes are in log points and book leverage is a ratio.</w:t>
+        <w:t>The bias bound is M̄ times the largest change between consecutive pre-coverage estimates times the weighted mean of (e + 1) over event years 0 to 3 (Eq. 10). The robust interval widens the bootstrap 95% interval by this bound.</w:t>
       </w:r>
     </w:p>
     <w:p>
@@ -5511,7 +5537,7 @@
                 <w:b/>
                 <w:sz w:val="18"/>
               </w:rPr>
-              <w:t>Control firms per cohort cell</w:t>
+              <w:t>Control firms (range)</w:t>
             </w:r>
           </w:p>
         </w:tc>
@@ -6194,20 +6220,7 @@
         <w:rPr>
           <w:sz w:val="20"/>
         </w:rPr>
-        <w:t xml:space="preserve">Scored firms are summed over cohorts; control firms are the never-scored firms available in each cohort's comparison of year </w:t>
-      </w:r>
-      <w:r>
-        <w:rPr>
-          <w:i/>
-          <w:sz w:val="20"/>
-        </w:rPr>
-        <w:t>g</w:t>
-      </w:r>
-      <w:r>
-        <w:rPr>
-          <w:sz w:val="20"/>
-        </w:rPr>
-        <w:t xml:space="preserve"> − 1 with the given event year, shown as the smallest and largest count across cohorts.</w:t>
+        <w:t>Scored firms are summed over cohorts; control firms are the smallest and largest number of never-scored firms across cohort cells.</w:t>
       </w:r>
     </w:p>
     <w:p>

</xml_diff>